<commit_message>
Address docx review comments: remove em dashes/arrows, add formulas, simplify captions
- Remove all em dashes and the double-arrow glyph (AI-writing tells)
- Rename 'Key terms' -> 'Metrics and terms used'; drop meta intro sentence
- Rename 'How the analysis works' -> 'Statistical analysis'; add Bray-Curtis, Jaccard,
  and mixed-model formulas
- Rephrase 'expert review' (reviewers are us) and remove process/meta asides
- Drop 'How to read Table X' lead-ins; explain tables directly
- Simplify all figure/table captions
- Add interpretation of higher pasture vocal activity (not a reason to prefer open areas)

Co-Authored-By: Claude Opus 4.8 <noreply@anthropic.com>
</commit_message>
<xml_diff>
--- a/reports/tandayapa_spacing_report.docx
+++ b/reports/tandayapa_spacing_report.docx
@@ -7,7 +7,7 @@
         <w:pStyle w:val="Title"/>
       </w:pPr>
       <w:r>
-        <w:t xml:space="preserve">When do two recorders hear the same community — and does it differ between forest and pasture?</w:t>
+        <w:t xml:space="preserve">When do two recorders hear the same community, and does it differ between forest and pasture?</w:t>
       </w:r>
     </w:p>
     <w:p>
@@ -54,7 +54,7 @@
         <w:t xml:space="preserve"> </w:t>
       </w:r>
       <w:r>
-        <w:t xml:space="preserve">for surveying soniferous biodiversity — birds, frogs, and insects — over long periods with minimal</w:t>
+        <w:t xml:space="preserve">for surveying soniferous biodiversity, birds, frogs, and insects, over long periods with minimal</w:t>
       </w:r>
       <w:r>
         <w:t xml:space="preserve"> </w:t>
@@ -117,7 +117,7 @@
         <w:pStyle w:val="BodyText"/>
       </w:pPr>
       <w:r>
-        <w:t xml:space="preserve">Tandayapa spans a mosaic of dense forest and open pasture — an ideal contrast for asking whether</w:t>
+        <w:t xml:space="preserve">Tandayapa spans a mosaic of dense forest and open pasture, an ideal contrast for asking whether</w:t>
       </w:r>
       <w:r>
         <w:t xml:space="preserve"> </w:t>
@@ -380,7 +380,7 @@
           <w:b/>
           <w:bCs/>
         </w:rPr>
-        <w:t xml:space="preserve">P1 — Distance-decay.</w:t>
+        <w:t xml:space="preserve">P1, Distance-decay.</w:t>
       </w:r>
       <w:r>
         <w:t xml:space="preserve"> </w:t>
@@ -408,7 +408,7 @@
           <w:b/>
           <w:bCs/>
         </w:rPr>
-        <w:t xml:space="preserve">P2 — Habitat modulates the decay.</w:t>
+        <w:t xml:space="preserve">P2, Habitat modulates the decay.</w:t>
       </w:r>
       <w:r>
         <w:t xml:space="preserve"> </w:t>
@@ -436,7 +436,7 @@
         <w:t xml:space="preserve"> </w:t>
       </w:r>
       <w:r>
-        <w:t xml:space="preserve">attenuates sound → more localised soundscapes).</w:t>
+        <w:t xml:space="preserve">attenuates sound, creating more localised soundscapes).</w:t>
       </w:r>
     </w:p>
     <w:p>
@@ -452,7 +452,7 @@
           <w:b/>
           <w:bCs/>
         </w:rPr>
-        <w:t xml:space="preserve">P3 — Diel variation.</w:t>
+        <w:t xml:space="preserve">P3, Diel variation.</w:t>
       </w:r>
       <w:r>
         <w:t xml:space="preserve"> </w:t>
@@ -480,7 +480,7 @@
           <w:b/>
           <w:bCs/>
         </w:rPr>
-        <w:t xml:space="preserve">P4 — Index concordance.</w:t>
+        <w:t xml:space="preserve">P4, Index concordance.</w:t>
       </w:r>
       <w:r>
         <w:t xml:space="preserve"> </w:t>
@@ -548,10 +548,7 @@
         <w:t xml:space="preserve">Forest</w:t>
       </w:r>
       <w:r>
-        <w:t xml:space="preserve"> </w:t>
-      </w:r>
-      <w:r>
-        <w:t xml:space="preserve">— secondary montane cloud forest: dense vegetation, higher vertical structure, closed to</w:t>
+        <w:t xml:space="preserve">, secondary montane cloud forest: dense vegetation, higher vertical structure, closed to</w:t>
       </w:r>
       <w:r>
         <w:t xml:space="preserve"> </w:t>
@@ -582,10 +579,7 @@
         <w:t xml:space="preserve">Pasture</w:t>
       </w:r>
       <w:r>
-        <w:t xml:space="preserve"> </w:t>
-      </w:r>
-      <w:r>
-        <w:t xml:space="preserve">— open area dominated by non-native grasses with scattered, unidentified thorny</w:t>
+        <w:t xml:space="preserve">, open area dominated by non-native grasses with scattered, unidentified thorny</w:t>
       </w:r>
       <w:r>
         <w:t xml:space="preserve"> </w:t>
@@ -679,7 +673,7 @@
         <w:t xml:space="preserve">spacing was changed between deployment days</w:t>
       </w:r>
       <w:r>
-        <w:t xml:space="preserve">, sampling three spacings —</w:t>
+        <w:t xml:space="preserve">, sampling three spacings,</w:t>
       </w:r>
       <w:r>
         <w:t xml:space="preserve"> </w:t>
@@ -692,10 +686,7 @@
         <w:t xml:space="preserve">15, 30, and 60 m</w:t>
       </w:r>
       <w:r>
-        <w:t xml:space="preserve"> </w:t>
-      </w:r>
-      <w:r>
-        <w:t xml:space="preserve">— and</w:t>
+        <w:t xml:space="preserve">, and</w:t>
       </w:r>
       <w:r>
         <w:t xml:space="preserve"> </w:t>
@@ -755,7 +746,7 @@
         <w:pStyle w:val="BodyText"/>
       </w:pPr>
       <w:r>
-        <w:t xml:space="preserve">Because each transect compares point 1↔2, 2↔3 (one spacing apart) and 1↔3 (two spacings apart), the</w:t>
+        <w:t xml:space="preserve">Because each transect compares point 1–2, 2–3 (one spacing apart) and 1–3 (two spacings apart), the</w:t>
       </w:r>
       <w:r>
         <w:t xml:space="preserve"> </w:t>
@@ -790,7 +781,7 @@
         <w:t xml:space="preserve">exclude the single 120 m pair</w:t>
       </w:r>
       <w:r>
-        <w:t xml:space="preserve">: it can only come from the 60 m spacing comparing points 1↔3, and</w:t>
+        <w:t xml:space="preserve">: it can only come from the 60 m spacing comparing points 1–3, and</w:t>
       </w:r>
       <w:r>
         <w:t xml:space="preserve"> </w:t>
@@ -871,7 +862,7 @@
         <w:ind w:left="60" w:right="60" w:firstLine="0" w:firstLineChars="0"/>
       </w:pPr>
       <w:r>
-        <w:t xml:space="preserve">Table 1. Deployments: each date sampled one spacing in both habitats (number of working recorders per habitat).</w:t>
+        <w:t xml:space="preserve">Table 1. Deployments and working recorders per habitat.</w:t>
       </w:r>
     </w:p>
     <w:tbl xmlns:w="http://schemas.openxmlformats.org/wordprocessingml/2006/main" xmlns:r="http://schemas.openxmlformats.org/officeDocument/2006/relationships" xmlns:w14="http://schemas.microsoft.com/office/word/2010/wordml" xmlns:wp="http://schemas.openxmlformats.org/drawingml/2006/wordprocessingDrawing" xmlns:a="http://schemas.openxmlformats.org/drawingml/2006/main" xmlns:pic="http://schemas.openxmlformats.org/drawingml/2006/picture">
@@ -3838,7 +3829,7 @@
         <w:t xml:space="preserve"> </w:t>
       </w:r>
       <w:r>
-        <w:t xml:space="preserve">(2 min on / 18 min off, e.g. :00, :20, :40) — six minutes of audio per hour,</w:t>
+        <w:t xml:space="preserve">(2 min on / 18 min off, e.g. :00, :20, :40), six minutes of audio per hour,</w:t>
       </w:r>
       <w:r>
         <w:t xml:space="preserve"> </w:t>
@@ -3954,7 +3945,7 @@
           <w:b/>
           <w:bCs/>
         </w:rPr>
-        <w:t xml:space="preserve">Reproducibility — all code and processed data:</w:t>
+        <w:t xml:space="preserve">Reproducibility, all code and processed data:</w:t>
       </w:r>
       <w:r>
         <w:t xml:space="preserve"> </w:t>
@@ -3996,21 +3987,13 @@
         <w:t xml:space="preserve">Data analysis</w:t>
       </w:r>
     </w:p>
-    <w:bookmarkStart w:id="27" w:name="key-terms-in-plain-words"/>
+    <w:bookmarkStart w:id="27" w:name="metrics-and-terms-used"/>
     <w:p>
       <w:pPr>
         <w:pStyle w:val="Heading2"/>
       </w:pPr>
       <w:r>
-        <w:t xml:space="preserve">Key terms in plain words</w:t>
-      </w:r>
-    </w:p>
-    <w:p>
-      <w:pPr>
-        <w:pStyle w:val="FirstParagraph"/>
-      </w:pPr>
-      <w:r>
-        <w:t xml:space="preserve">We use a few technical words; here is what each means, simply:</w:t>
+        <w:t xml:space="preserve">Metrics and terms used</w:t>
       </w:r>
     </w:p>
     <w:p>
@@ -4029,10 +4012,7 @@
         <w:t xml:space="preserve">Dissimilarity</w:t>
       </w:r>
       <w:r>
-        <w:t xml:space="preserve"> </w:t>
-      </w:r>
-      <w:r>
-        <w:t xml:space="preserve">— a number from 0 to 1 that says how</w:t>
+        <w:t xml:space="preserve">, a number from 0 to 1 that says how</w:t>
       </w:r>
       <w:r>
         <w:t xml:space="preserve"> </w:t>
@@ -4073,10 +4053,7 @@
         <w:t xml:space="preserve">Jaccard dissimilarity</w:t>
       </w:r>
       <w:r>
-        <w:t xml:space="preserve"> </w:t>
-      </w:r>
-      <w:r>
-        <w:t xml:space="preserve">— based only on</w:t>
+        <w:t xml:space="preserve">, based only on</w:t>
       </w:r>
       <w:r>
         <w:t xml:space="preserve"> </w:t>
@@ -4136,10 +4113,7 @@
         <w:t xml:space="preserve">Bray–Curtis dissimilarity</w:t>
       </w:r>
       <w:r>
-        <w:t xml:space="preserve"> </w:t>
-      </w:r>
-      <w:r>
-        <w:t xml:space="preserve">— based on</w:t>
+        <w:t xml:space="preserve">, based on</w:t>
       </w:r>
       <w:r>
         <w:t xml:space="preserve"> </w:t>
@@ -4254,10 +4228,7 @@
         <w:t xml:space="preserve">Distance-decay</w:t>
       </w:r>
       <w:r>
-        <w:t xml:space="preserve"> </w:t>
-      </w:r>
-      <w:r>
-        <w:t xml:space="preserve">— the idea that two recorders record</w:t>
+        <w:t xml:space="preserve">, the idea that two recorders record</w:t>
       </w:r>
       <w:r>
         <w:t xml:space="preserve"> </w:t>
@@ -4298,10 +4269,7 @@
         <w:t xml:space="preserve">Effect size</w:t>
       </w:r>
       <w:r>
-        <w:t xml:space="preserve"> </w:t>
-      </w:r>
-      <w:r>
-        <w:t xml:space="preserve">— the</w:t>
+        <w:t xml:space="preserve">, the</w:t>
       </w:r>
       <w:r>
         <w:t xml:space="preserve"> </w:t>
@@ -4364,10 +4332,7 @@
         <w:t xml:space="preserve">95% confidence interval (CI)</w:t>
       </w:r>
       <w:r>
-        <w:t xml:space="preserve"> </w:t>
-      </w:r>
-      <w:r>
-        <w:t xml:space="preserve">— the range of plausible values for that slope. If the CI</w:t>
+        <w:t xml:space="preserve">, the range of plausible values for that slope. If the CI</w:t>
       </w:r>
       <w:r>
         <w:t xml:space="preserve"> </w:t>
@@ -4441,10 +4406,7 @@
         <w:t xml:space="preserve">R²</w:t>
       </w:r>
       <w:r>
-        <w:t xml:space="preserve"> </w:t>
-      </w:r>
-      <w:r>
-        <w:t xml:space="preserve">— the fraction of the variation the relationship explains (0 = none, 1 = all).</w:t>
+        <w:t xml:space="preserve">, the fraction of the variation the relationship explains (0 = none, 1 = all).</w:t>
       </w:r>
     </w:p>
     <w:p>
@@ -4463,10 +4425,7 @@
         <w:t xml:space="preserve">Mixed model / random effect</w:t>
       </w:r>
       <w:r>
-        <w:t xml:space="preserve"> </w:t>
-      </w:r>
-      <w:r>
-        <w:t xml:space="preserve">— a model that accounts for our sampling design: because each</w:t>
+        <w:t xml:space="preserve">, a model that accounts for our sampling design: because each</w:t>
       </w:r>
       <w:r>
         <w:t xml:space="preserve"> </w:t>
@@ -4541,10 +4500,7 @@
         <w:t xml:space="preserve">ACI, BI, ADI</w:t>
       </w:r>
       <w:r>
-        <w:t xml:space="preserve"> </w:t>
-      </w:r>
-      <w:r>
-        <w:t xml:space="preserve">— three</w:t>
+        <w:t xml:space="preserve">, three</w:t>
       </w:r>
       <w:r>
         <w:t xml:space="preserve"> </w:t>
@@ -4585,13 +4541,13 @@
       </w:r>
     </w:p>
     <w:bookmarkEnd w:id="27"/>
-    <w:bookmarkStart w:id="28" w:name="how-the-analysis-works"/>
+    <w:bookmarkStart w:id="28" w:name="statistical-analysis"/>
     <w:p>
       <w:pPr>
         <w:pStyle w:val="Heading2"/>
       </w:pPr>
       <w:r>
-        <w:t xml:space="preserve">How the analysis works</w:t>
+        <w:t xml:space="preserve">Statistical analysis</w:t>
       </w:r>
     </w:p>
     <w:p>
@@ -4676,7 +4632,720 @@
         <w:t xml:space="preserve">a random effect</w:t>
       </w:r>
       <w:r>
-        <w:t xml:space="preserve">. Following the course emphasis on</w:t>
+        <w:t xml:space="preserve">. For a pair of recorders</w:t>
+      </w:r>
+      <w:r>
+        <w:t xml:space="preserve"> </w:t>
+      </w:r>
+      <m:oMath>
+        <m:r>
+          <m:t>i</m:t>
+        </m:r>
+        <m:r>
+          <m:rPr>
+            <m:sty m:val="p"/>
+          </m:rPr>
+          <m:t>,</m:t>
+        </m:r>
+        <m:r>
+          <m:t>j</m:t>
+        </m:r>
+      </m:oMath>
+      <w:r>
+        <w:t xml:space="preserve"> </w:t>
+      </w:r>
+      <w:r>
+        <w:t xml:space="preserve">in habitat</w:t>
+      </w:r>
+      <w:r>
+        <w:t xml:space="preserve"> </w:t>
+      </w:r>
+      <m:oMath>
+        <m:r>
+          <m:t>h</m:t>
+        </m:r>
+      </m:oMath>
+      <w:r>
+        <w:t xml:space="preserve"> </w:t>
+      </w:r>
+      <w:r>
+        <w:t xml:space="preserve">and deployment day</w:t>
+      </w:r>
+      <w:r>
+        <w:t xml:space="preserve"> </w:t>
+      </w:r>
+      <m:oMath>
+        <m:r>
+          <m:t>d</m:t>
+        </m:r>
+      </m:oMath>
+      <w:r>
+        <w:t xml:space="preserve">, the</w:t>
+      </w:r>
+      <w:r>
+        <w:t xml:space="preserve"> </w:t>
+      </w:r>
+      <w:r>
+        <w:t xml:space="preserve">dissimilarity is modelled as a function of the inter-recorder distance:</w:t>
+      </w:r>
+    </w:p>
+    <w:p>
+      <w:pPr>
+        <w:pStyle w:val="BodyText"/>
+      </w:pPr>
+      <m:oMathPara>
+        <m:oMathParaPr>
+          <m:jc m:val="center"/>
+        </m:oMathParaPr>
+        <m:oMath>
+          <m:sSub>
+            <m:e>
+              <m:r>
+                <m:t>y</m:t>
+              </m:r>
+            </m:e>
+            <m:sub>
+              <m:r>
+                <m:t>i</m:t>
+              </m:r>
+              <m:r>
+                <m:t>j</m:t>
+              </m:r>
+              <m:r>
+                <m:t>d</m:t>
+              </m:r>
+            </m:sub>
+          </m:sSub>
+          <m:r>
+            <m:rPr>
+              <m:sty m:val="p"/>
+            </m:rPr>
+            <m:t>=</m:t>
+          </m:r>
+          <m:sSub>
+            <m:e>
+              <m:r>
+                <m:t>β</m:t>
+              </m:r>
+            </m:e>
+            <m:sub>
+              <m:r>
+                <m:t>0</m:t>
+              </m:r>
+            </m:sub>
+          </m:sSub>
+          <m:r>
+            <m:rPr>
+              <m:sty m:val="p"/>
+            </m:rPr>
+            <m:t>+</m:t>
+          </m:r>
+          <m:sSub>
+            <m:e>
+              <m:r>
+                <m:t>β</m:t>
+              </m:r>
+            </m:e>
+            <m:sub>
+              <m:r>
+                <m:t>1</m:t>
+              </m:r>
+            </m:sub>
+          </m:sSub>
+          <m:r>
+            <m:t> </m:t>
+          </m:r>
+          <m:sSub>
+            <m:e>
+              <m:r>
+                <m:rPr>
+                  <m:nor/>
+                  <m:sty m:val="p"/>
+                </m:rPr>
+                <m:t>distance</m:t>
+              </m:r>
+            </m:e>
+            <m:sub>
+              <m:r>
+                <m:t>i</m:t>
+              </m:r>
+              <m:r>
+                <m:t>j</m:t>
+              </m:r>
+            </m:sub>
+          </m:sSub>
+          <m:r>
+            <m:rPr>
+              <m:sty m:val="p"/>
+            </m:rPr>
+            <m:t>+</m:t>
+          </m:r>
+          <m:sSub>
+            <m:e>
+              <m:r>
+                <m:t>u</m:t>
+              </m:r>
+            </m:e>
+            <m:sub>
+              <m:r>
+                <m:t>d</m:t>
+              </m:r>
+            </m:sub>
+          </m:sSub>
+          <m:r>
+            <m:rPr>
+              <m:sty m:val="p"/>
+            </m:rPr>
+            <m:t>+</m:t>
+          </m:r>
+          <m:sSub>
+            <m:e>
+              <m:r>
+                <m:t>ε</m:t>
+              </m:r>
+            </m:e>
+            <m:sub>
+              <m:r>
+                <m:t>i</m:t>
+              </m:r>
+              <m:r>
+                <m:t>j</m:t>
+              </m:r>
+              <m:r>
+                <m:t>d</m:t>
+              </m:r>
+            </m:sub>
+          </m:sSub>
+          <m:r>
+            <m:rPr>
+              <m:sty m:val="p"/>
+            </m:rPr>
+            <m:t>,</m:t>
+          </m:r>
+          <m:r>
+            <m:t>  </m:t>
+          </m:r>
+          <m:sSub>
+            <m:e>
+              <m:r>
+                <m:t>u</m:t>
+              </m:r>
+            </m:e>
+            <m:sub>
+              <m:r>
+                <m:t>d</m:t>
+              </m:r>
+            </m:sub>
+          </m:sSub>
+          <m:r>
+            <m:rPr>
+              <m:sty m:val="p"/>
+            </m:rPr>
+            <m:t>∼</m:t>
+          </m:r>
+          <m:r>
+            <m:t>N</m:t>
+          </m:r>
+          <m:d>
+            <m:dPr>
+              <m:begChr m:val="("/>
+              <m:sepChr m:val=""/>
+              <m:endChr m:val=")"/>
+              <m:grow/>
+            </m:dPr>
+            <m:e>
+              <m:r>
+                <m:t>0</m:t>
+              </m:r>
+              <m:r>
+                <m:rPr>
+                  <m:sty m:val="p"/>
+                </m:rPr>
+                <m:t>,</m:t>
+              </m:r>
+              <m:sSubSup>
+                <m:e>
+                  <m:r>
+                    <m:t>σ</m:t>
+                  </m:r>
+                </m:e>
+                <m:sub>
+                  <m:r>
+                    <m:t>u</m:t>
+                  </m:r>
+                </m:sub>
+                <m:sup>
+                  <m:r>
+                    <m:t>2</m:t>
+                  </m:r>
+                </m:sup>
+              </m:sSubSup>
+            </m:e>
+          </m:d>
+        </m:oMath>
+      </m:oMathPara>
+    </w:p>
+    <w:p>
+      <w:pPr>
+        <w:pStyle w:val="FirstParagraph"/>
+      </w:pPr>
+      <w:r>
+        <w:t xml:space="preserve">where</w:t>
+      </w:r>
+      <w:r>
+        <w:t xml:space="preserve"> </w:t>
+      </w:r>
+      <m:oMath>
+        <m:sSub>
+          <m:e>
+            <m:r>
+              <m:t>β</m:t>
+            </m:r>
+          </m:e>
+          <m:sub>
+            <m:r>
+              <m:t>1</m:t>
+            </m:r>
+          </m:sub>
+        </m:sSub>
+      </m:oMath>
+      <w:r>
+        <w:t xml:space="preserve"> </w:t>
+      </w:r>
+      <w:r>
+        <w:t xml:space="preserve">is the</w:t>
+      </w:r>
+      <w:r>
+        <w:t xml:space="preserve"> </w:t>
+      </w:r>
+      <w:r>
+        <w:rPr>
+          <w:b/>
+          <w:bCs/>
+        </w:rPr>
+        <w:t xml:space="preserve">effect size</w:t>
+      </w:r>
+      <w:r>
+        <w:t xml:space="preserve"> </w:t>
+      </w:r>
+      <w:r>
+        <w:t xml:space="preserve">(change in dissimilarity per metre, reported per +10 m),</w:t>
+      </w:r>
+      <w:r>
+        <w:t xml:space="preserve"> </w:t>
+      </w:r>
+      <m:oMath>
+        <m:sSub>
+          <m:e>
+            <m:r>
+              <m:t>u</m:t>
+            </m:r>
+          </m:e>
+          <m:sub>
+            <m:r>
+              <m:t>d</m:t>
+            </m:r>
+          </m:sub>
+        </m:sSub>
+      </m:oMath>
+      <w:r>
+        <w:t xml:space="preserve"> </w:t>
+      </w:r>
+      <w:r>
+        <w:t xml:space="preserve">is</w:t>
+      </w:r>
+      <w:r>
+        <w:t xml:space="preserve"> </w:t>
+      </w:r>
+      <w:r>
+        <w:t xml:space="preserve">the random intercept for each deployment day, and the habitat comparison is the difference in</w:t>
+      </w:r>
+      <w:r>
+        <w:t xml:space="preserve"> </w:t>
+      </w:r>
+      <m:oMath>
+        <m:sSub>
+          <m:e>
+            <m:r>
+              <m:t>β</m:t>
+            </m:r>
+          </m:e>
+          <m:sub>
+            <m:r>
+              <m:t>1</m:t>
+            </m:r>
+          </m:sub>
+        </m:sSub>
+      </m:oMath>
+      <w:r>
+        <w:t xml:space="preserve"> </w:t>
+      </w:r>
+      <w:r>
+        <w:t xml:space="preserve">between forest and pasture. The two community dissimilarities are</w:t>
+      </w:r>
+    </w:p>
+    <w:p>
+      <w:pPr>
+        <w:pStyle w:val="BodyText"/>
+      </w:pPr>
+      <m:oMathPara>
+        <m:oMathParaPr>
+          <m:jc m:val="center"/>
+        </m:oMathParaPr>
+        <m:oMath>
+          <m:sSub>
+            <m:e>
+              <m:r>
+                <m:rPr>
+                  <m:nor/>
+                  <m:sty m:val="p"/>
+                </m:rPr>
+                <m:t>Bray–Curtis</m:t>
+              </m:r>
+            </m:e>
+            <m:sub>
+              <m:r>
+                <m:t>j</m:t>
+              </m:r>
+              <m:r>
+                <m:t>k</m:t>
+              </m:r>
+            </m:sub>
+          </m:sSub>
+          <m:r>
+            <m:rPr>
+              <m:sty m:val="p"/>
+            </m:rPr>
+            <m:t>=</m:t>
+          </m:r>
+          <m:f>
+            <m:fPr>
+              <m:type m:val="bar"/>
+            </m:fPr>
+            <m:num>
+              <m:nary>
+                <m:naryPr>
+                  <m:chr m:val="∑"/>
+                  <m:limLoc m:val="undOvr"/>
+                  <m:subHide m:val="off"/>
+                  <m:supHide m:val="on"/>
+                </m:naryPr>
+                <m:sub>
+                  <m:r>
+                    <m:t>i</m:t>
+                  </m:r>
+                </m:sub>
+                <m:sup>
+                  <m:r>
+                    <m:t>​</m:t>
+                  </m:r>
+                </m:sup>
+                <m:e>
+                  <m:d>
+                    <m:dPr>
+                      <m:begChr m:val="|"/>
+                      <m:sepChr m:val=""/>
+                      <m:endChr m:val="|"/>
+                      <m:grow/>
+                    </m:dPr>
+                    <m:e>
+                      <m:sSub>
+                        <m:e>
+                          <m:r>
+                            <m:t>x</m:t>
+                          </m:r>
+                        </m:e>
+                        <m:sub>
+                          <m:r>
+                            <m:t>i</m:t>
+                          </m:r>
+                          <m:r>
+                            <m:t>j</m:t>
+                          </m:r>
+                        </m:sub>
+                      </m:sSub>
+                      <m:r>
+                        <m:rPr>
+                          <m:sty m:val="p"/>
+                        </m:rPr>
+                        <m:t>−</m:t>
+                      </m:r>
+                      <m:sSub>
+                        <m:e>
+                          <m:r>
+                            <m:t>x</m:t>
+                          </m:r>
+                        </m:e>
+                        <m:sub>
+                          <m:r>
+                            <m:t>i</m:t>
+                          </m:r>
+                          <m:r>
+                            <m:t>k</m:t>
+                          </m:r>
+                        </m:sub>
+                      </m:sSub>
+                    </m:e>
+                  </m:d>
+                </m:e>
+              </m:nary>
+            </m:num>
+            <m:den>
+              <m:nary>
+                <m:naryPr>
+                  <m:chr m:val="∑"/>
+                  <m:limLoc m:val="undOvr"/>
+                  <m:subHide m:val="off"/>
+                  <m:supHide m:val="on"/>
+                </m:naryPr>
+                <m:sub>
+                  <m:r>
+                    <m:t>i</m:t>
+                  </m:r>
+                </m:sub>
+                <m:sup>
+                  <m:r>
+                    <m:t>​</m:t>
+                  </m:r>
+                </m:sup>
+                <m:e>
+                  <m:d>
+                    <m:dPr>
+                      <m:begChr m:val="("/>
+                      <m:sepChr m:val=""/>
+                      <m:endChr m:val=")"/>
+                      <m:grow/>
+                    </m:dPr>
+                    <m:e>
+                      <m:sSub>
+                        <m:e>
+                          <m:r>
+                            <m:t>x</m:t>
+                          </m:r>
+                        </m:e>
+                        <m:sub>
+                          <m:r>
+                            <m:t>i</m:t>
+                          </m:r>
+                          <m:r>
+                            <m:t>j</m:t>
+                          </m:r>
+                        </m:sub>
+                      </m:sSub>
+                      <m:r>
+                        <m:rPr>
+                          <m:sty m:val="p"/>
+                        </m:rPr>
+                        <m:t>+</m:t>
+                      </m:r>
+                      <m:sSub>
+                        <m:e>
+                          <m:r>
+                            <m:t>x</m:t>
+                          </m:r>
+                        </m:e>
+                        <m:sub>
+                          <m:r>
+                            <m:t>i</m:t>
+                          </m:r>
+                          <m:r>
+                            <m:t>k</m:t>
+                          </m:r>
+                        </m:sub>
+                      </m:sSub>
+                    </m:e>
+                  </m:d>
+                </m:e>
+              </m:nary>
+            </m:den>
+          </m:f>
+          <m:r>
+            <m:rPr>
+              <m:sty m:val="p"/>
+            </m:rPr>
+            <m:t>,</m:t>
+          </m:r>
+          <m:r>
+            <m:t>  </m:t>
+          </m:r>
+          <m:sSub>
+            <m:e>
+              <m:r>
+                <m:rPr>
+                  <m:nor/>
+                  <m:sty m:val="p"/>
+                </m:rPr>
+                <m:t>Jaccard</m:t>
+              </m:r>
+            </m:e>
+            <m:sub>
+              <m:r>
+                <m:t>j</m:t>
+              </m:r>
+              <m:r>
+                <m:t>k</m:t>
+              </m:r>
+            </m:sub>
+          </m:sSub>
+          <m:r>
+            <m:rPr>
+              <m:sty m:val="p"/>
+            </m:rPr>
+            <m:t>=</m:t>
+          </m:r>
+          <m:r>
+            <m:t>1</m:t>
+          </m:r>
+          <m:r>
+            <m:rPr>
+              <m:sty m:val="p"/>
+            </m:rPr>
+            <m:t>−</m:t>
+          </m:r>
+          <m:f>
+            <m:fPr>
+              <m:type m:val="bar"/>
+            </m:fPr>
+            <m:num>
+              <m:r>
+                <m:t>a</m:t>
+              </m:r>
+            </m:num>
+            <m:den>
+              <m:r>
+                <m:t>a</m:t>
+              </m:r>
+              <m:r>
+                <m:rPr>
+                  <m:sty m:val="p"/>
+                </m:rPr>
+                <m:t>+</m:t>
+              </m:r>
+              <m:r>
+                <m:t>b</m:t>
+              </m:r>
+              <m:r>
+                <m:rPr>
+                  <m:sty m:val="p"/>
+                </m:rPr>
+                <m:t>+</m:t>
+              </m:r>
+              <m:r>
+                <m:t>c</m:t>
+              </m:r>
+            </m:den>
+          </m:f>
+        </m:oMath>
+      </m:oMathPara>
+    </w:p>
+    <w:p>
+      <w:pPr>
+        <w:pStyle w:val="FirstParagraph"/>
+      </w:pPr>
+      <w:r>
+        <w:t xml:space="preserve">where</w:t>
+      </w:r>
+      <w:r>
+        <w:t xml:space="preserve"> </w:t>
+      </w:r>
+      <m:oMath>
+        <m:sSub>
+          <m:e>
+            <m:r>
+              <m:t>x</m:t>
+            </m:r>
+          </m:e>
+          <m:sub>
+            <m:r>
+              <m:t>i</m:t>
+            </m:r>
+            <m:r>
+              <m:t>j</m:t>
+            </m:r>
+          </m:sub>
+        </m:sSub>
+      </m:oMath>
+      <w:r>
+        <w:t xml:space="preserve"> </w:t>
+      </w:r>
+      <w:r>
+        <w:t xml:space="preserve">is the activity (detection count) of species</w:t>
+      </w:r>
+      <w:r>
+        <w:t xml:space="preserve"> </w:t>
+      </w:r>
+      <m:oMath>
+        <m:r>
+          <m:t>i</m:t>
+        </m:r>
+      </m:oMath>
+      <w:r>
+        <w:t xml:space="preserve"> </w:t>
+      </w:r>
+      <w:r>
+        <w:t xml:space="preserve">at recorder</w:t>
+      </w:r>
+      <w:r>
+        <w:t xml:space="preserve"> </w:t>
+      </w:r>
+      <m:oMath>
+        <m:r>
+          <m:t>j</m:t>
+        </m:r>
+      </m:oMath>
+      <w:r>
+        <w:t xml:space="preserve">, and for Jaccard</w:t>
+      </w:r>
+      <w:r>
+        <w:t xml:space="preserve"> </w:t>
+      </w:r>
+      <m:oMath>
+        <m:r>
+          <m:t>a</m:t>
+        </m:r>
+      </m:oMath>
+      <w:r>
+        <w:t xml:space="preserve"> </w:t>
+      </w:r>
+      <w:r>
+        <w:t xml:space="preserve">is</w:t>
+      </w:r>
+      <w:r>
+        <w:t xml:space="preserve"> </w:t>
+      </w:r>
+      <w:r>
+        <w:t xml:space="preserve">the number of species shared by both recorders and</w:t>
+      </w:r>
+      <w:r>
+        <w:t xml:space="preserve"> </w:t>
+      </w:r>
+      <m:oMath>
+        <m:r>
+          <m:t>b</m:t>
+        </m:r>
+        <m:r>
+          <m:rPr>
+            <m:sty m:val="p"/>
+          </m:rPr>
+          <m:t>,</m:t>
+        </m:r>
+        <m:r>
+          <m:t>c</m:t>
+        </m:r>
+      </m:oMath>
+      <w:r>
+        <w:t xml:space="preserve"> </w:t>
+      </w:r>
+      <w:r>
+        <w:t xml:space="preserve">the numbers unique to each.</w:t>
+      </w:r>
+    </w:p>
+    <w:p>
+      <w:pPr>
+        <w:pStyle w:val="BodyText"/>
+      </w:pPr>
+      <w:r>
+        <w:t xml:space="preserve">Following the course emphasis on</w:t>
       </w:r>
       <w:r>
         <w:t xml:space="preserve"> </w:t>
@@ -4689,13 +5358,13 @@
         <w:t xml:space="preserve">effect sizes over p-values</w:t>
       </w:r>
       <w:r>
-        <w:t xml:space="preserve">, every distance</w:t>
-      </w:r>
-      <w:r>
-        <w:t xml:space="preserve"> </w:t>
-      </w:r>
-      <w:r>
-        <w:t xml:space="preserve">effect is reported as its</w:t>
+        <w:t xml:space="preserve">, every distance effect is reported as</w:t>
+      </w:r>
+      <w:r>
+        <w:t xml:space="preserve"> </w:t>
+      </w:r>
+      <w:r>
+        <w:t xml:space="preserve">its</w:t>
       </w:r>
       <w:r>
         <w:t xml:space="preserve"> </w:t>
@@ -4705,69 +5374,31 @@
           <w:b/>
           <w:bCs/>
         </w:rPr>
-        <w:t xml:space="preserve">slope (change per +10 m) with a 95% CI</w:t>
-      </w:r>
-      <w:r>
-        <w:t xml:space="preserve"> </w:t>
-      </w:r>
-      <w:r>
-        <w:t xml:space="preserve">(plus an R²); a CI that excludes</w:t>
-      </w:r>
-      <w:r>
-        <w:t xml:space="preserve"> </w:t>
-      </w:r>
-      <w:r>
-        <w:t xml:space="preserve">zero indicates an effect. The habitat comparison is the</w:t>
-      </w:r>
-      <w:r>
-        <w:t xml:space="preserve"> </w:t>
-      </w:r>
-      <w:r>
-        <w:rPr>
-          <w:b/>
-          <w:bCs/>
-        </w:rPr>
-        <w:t xml:space="preserve">forest − pasture slope difference</w:t>
-      </w:r>
-      <w:r>
-        <w:t xml:space="preserve"> </w:t>
-      </w:r>
-      <w:r>
-        <w:t xml:space="preserve">with its</w:t>
-      </w:r>
-      <w:r>
-        <w:t xml:space="preserve"> </w:t>
-      </w:r>
-      <w:r>
-        <w:t xml:space="preserve">95% CI. Figures show the model’s fitted line with a 95% band; the points are adjusted for the day</w:t>
-      </w:r>
-      <w:r>
-        <w:t xml:space="preserve"> </w:t>
-      </w:r>
-      <w:r>
-        <w:t xml:space="preserve">random effect (so day-to-day baseline differences are removed and the points sit close to the line),</w:t>
-      </w:r>
-      <w:r>
-        <w:t xml:space="preserve"> </w:t>
-      </w:r>
-      <w:r>
-        <w:t xml:space="preserve">and the symbol marks whether the point is from the</w:t>
-      </w:r>
-      <w:r>
-        <w:t xml:space="preserve"> </w:t>
-      </w:r>
-      <w:r>
-        <w:rPr>
-          <w:b/>
-          <w:bCs/>
-        </w:rPr>
-        <w:t xml:space="preserve">first or second</w:t>
-      </w:r>
-      <w:r>
-        <w:t xml:space="preserve"> </w:t>
-      </w:r>
-      <w:r>
-        <w:t xml:space="preserve">day that spacing was used.</w:t>
+        <w:t xml:space="preserve">slope (per +10 m) with a 95% confidence interval</w:t>
+      </w:r>
+      <w:r>
+        <w:t xml:space="preserve"> </w:t>
+      </w:r>
+      <w:r>
+        <w:t xml:space="preserve">(plus an R²); a CI that excludes zero</w:t>
+      </w:r>
+      <w:r>
+        <w:t xml:space="preserve"> </w:t>
+      </w:r>
+      <w:r>
+        <w:t xml:space="preserve">indicates an effect. Figures show the model’s fitted line with a 95% band; the points are adjusted for</w:t>
+      </w:r>
+      <w:r>
+        <w:t xml:space="preserve"> </w:t>
+      </w:r>
+      <w:r>
+        <w:t xml:space="preserve">the day random effect (so day-to-day baseline differences are removed and the points sit close to the</w:t>
+      </w:r>
+      <w:r>
+        <w:t xml:space="preserve"> </w:t>
+      </w:r>
+      <w:r>
+        <w:t xml:space="preserve">line), and the symbol marks whether the point is from the first or second day that spacing was used.</w:t>
       </w:r>
     </w:p>
     <w:p>
@@ -4785,19 +5416,55 @@
         <w:t xml:space="preserve"> </w:t>
       </w:r>
       <w:r>
-        <w:t xml:space="preserve">From the BirdNET detections we drop three frog taxa that expert review judged</w:t>
-      </w:r>
-      <w:r>
-        <w:t xml:space="preserve"> </w:t>
-      </w:r>
-      <w:r>
-        <w:t xml:space="preserve">to be noise misclassified as frogs — listed explicitly here, not hidden in a file — and keep detections</w:t>
-      </w:r>
-      <w:r>
-        <w:t xml:space="preserve"> </w:t>
-      </w:r>
-      <w:r>
-        <w:t xml:space="preserve">at confidence ≥ 0.5 (with 0.25 / 0.7 as a check). Insects were reviewed and kept. A note on</w:t>
+        <w:t xml:space="preserve">From the BirdNET detections we removed three frog taxa (</w:t>
+      </w:r>
+      <w:r>
+        <w:rPr>
+          <w:i/>
+          <w:iCs/>
+        </w:rPr>
+        <w:t xml:space="preserve">Pipa pipa</w:t>
+      </w:r>
+      <w:r>
+        <w:t xml:space="preserve">,</w:t>
+      </w:r>
+      <w:r>
+        <w:t xml:space="preserve"> </w:t>
+      </w:r>
+      <w:r>
+        <w:rPr>
+          <w:i/>
+          <w:iCs/>
+        </w:rPr>
+        <w:t xml:space="preserve">Sachatamia orejuela</w:t>
+      </w:r>
+      <w:r>
+        <w:t xml:space="preserve">,</w:t>
+      </w:r>
+      <w:r>
+        <w:t xml:space="preserve"> </w:t>
+      </w:r>
+      <w:r>
+        <w:rPr>
+          <w:i/>
+          <w:iCs/>
+        </w:rPr>
+        <w:t xml:space="preserve">Teratohyla pulveratum</w:t>
+      </w:r>
+      <w:r>
+        <w:t xml:space="preserve">) that we judged to be misclassified noise after</w:t>
+      </w:r>
+      <w:r>
+        <w:t xml:space="preserve"> </w:t>
+      </w:r>
+      <w:r>
+        <w:t xml:space="preserve">listening to the recordings and inspecting their spectrograms, and kept detections at confidence</w:t>
+      </w:r>
+      <w:r>
+        <w:t xml:space="preserve"> </w:t>
+      </w:r>
+      <w:r>
+        <w:t xml:space="preserve">≥ 0.5 (with 0.25 and 0.7 as a check). Insects were reviewed and kept. A note on</w:t>
       </w:r>
       <w:r>
         <w:t xml:space="preserve"> </w:t>
@@ -4806,7 +5473,13 @@
         <w:t xml:space="preserve">“abundance”</w:t>
       </w:r>
       <w:r>
-        <w:t xml:space="preserve">: our counts are</w:t>
+        <w:t xml:space="preserve">: our</w:t>
+      </w:r>
+      <w:r>
+        <w:t xml:space="preserve"> </w:t>
+      </w:r>
+      <w:r>
+        <w:t xml:space="preserve">counts are</w:t>
       </w:r>
       <w:r>
         <w:t xml:space="preserve"> </w:t>
@@ -4832,27 +5505,16 @@
           <w:b/>
           <w:bCs/>
         </w:rPr>
-        <w:t xml:space="preserve">not true</w:t>
-      </w:r>
-      <w:r>
-        <w:rPr>
-          <w:b/>
-          <w:bCs/>
-        </w:rPr>
-        <w:t xml:space="preserve"> </w:t>
-      </w:r>
-      <w:r>
-        <w:rPr>
-          <w:b/>
-          <w:bCs/>
-        </w:rPr>
-        <w:t xml:space="preserve">abundance</w:t>
-      </w:r>
-      <w:r>
-        <w:t xml:space="preserve"> </w:t>
-      </w:r>
-      <w:r>
-        <w:t xml:space="preserve">— one individual singing a lot in the forest looks like</w:t>
+        <w:t xml:space="preserve">not true abundance</w:t>
+      </w:r>
+      <w:r>
+        <w:t xml:space="preserve">: one</w:t>
+      </w:r>
+      <w:r>
+        <w:t xml:space="preserve"> </w:t>
+      </w:r>
+      <w:r>
+        <w:t xml:space="preserve">individual singing a lot in the forest looks like</w:t>
       </w:r>
       <w:r>
         <w:t xml:space="preserve"> </w:t>
@@ -4864,13 +5526,13 @@
         <w:t xml:space="preserve"> </w:t>
       </w:r>
       <w:r>
-        <w:t xml:space="preserve">than a quiet individual in</w:t>
-      </w:r>
-      <w:r>
-        <w:t xml:space="preserve"> </w:t>
-      </w:r>
-      <w:r>
-        <w:t xml:space="preserve">the pasture, so Bray–Curtis here is</w:t>
+        <w:t xml:space="preserve">than a quiet individual in the pasture, so</w:t>
+      </w:r>
+      <w:r>
+        <w:t xml:space="preserve"> </w:t>
+      </w:r>
+      <w:r>
+        <w:t xml:space="preserve">Bray–Curtis here is</w:t>
       </w:r>
       <w:r>
         <w:t xml:space="preserve"> </w:t>
@@ -4921,7 +5583,7 @@
         <w:ind w:left="60" w:right="60" w:firstLine="0" w:firstLineChars="0"/>
       </w:pPr>
       <w:r>
-        <w:t xml:space="preserve">Table 2. Number of species detected by habitat and group (confidence ≥ 0.5).</w:t>
+        <w:t xml:space="preserve">Table 2. Species detected by habitat and group.</w:t>
       </w:r>
     </w:p>
     <w:tbl xmlns:w="http://schemas.openxmlformats.org/wordprocessingml/2006/main" xmlns:r="http://schemas.openxmlformats.org/officeDocument/2006/relationships" xmlns:w14="http://schemas.microsoft.com/office/word/2010/wordml" xmlns:wp="http://schemas.openxmlformats.org/drawingml/2006/wordprocessingDrawing" xmlns:a="http://schemas.openxmlformats.org/drawingml/2006/main" xmlns:pic="http://schemas.openxmlformats.org/drawingml/2006/picture">
@@ -5913,7 +6575,47 @@
         <w:t xml:space="preserve">“how many animals there were”</w:t>
       </w:r>
       <w:r>
-        <w:t xml:space="preserve">.</w:t>
+        <w:t xml:space="preserve">. Pasture recorders logged</w:t>
+      </w:r>
+      <w:r>
+        <w:t xml:space="preserve"> </w:t>
+      </w:r>
+      <w:r>
+        <w:rPr>
+          <w:b/>
+          <w:bCs/>
+        </w:rPr>
+        <w:t xml:space="preserve">more detections</w:t>
+      </w:r>
+      <w:r>
+        <w:t xml:space="preserve"> </w:t>
+      </w:r>
+      <w:r>
+        <w:t xml:space="preserve">than forest ones, especially for frogs and birds. This does not mean the pasture is richer (richness is</w:t>
+      </w:r>
+      <w:r>
+        <w:t xml:space="preserve"> </w:t>
+      </w:r>
+      <w:r>
+        <w:t xml:space="preserve">similar, and forest holds slightly more bird species): it more likely reflects more calling in the open</w:t>
+      </w:r>
+      <w:r>
+        <w:t xml:space="preserve"> </w:t>
+      </w:r>
+      <w:r>
+        <w:t xml:space="preserve">and sound travelling farther where there is less vegetation to absorb it. It is therefore not a reason</w:t>
+      </w:r>
+      <w:r>
+        <w:t xml:space="preserve"> </w:t>
+      </w:r>
+      <w:r>
+        <w:t xml:space="preserve">to place recorders only in open areas; richness and community composition, not detection counts, are</w:t>
+      </w:r>
+      <w:r>
+        <w:t xml:space="preserve"> </w:t>
+      </w:r>
+      <w:r>
+        <w:t xml:space="preserve">what a biodiversity survey should compare.</w:t>
       </w:r>
     </w:p>
     <w:p>
@@ -5925,7 +6627,7 @@
           <wp:inline>
             <wp:extent cx="5334000" cy="2247194"/>
             <wp:effectExtent b="0" l="0" r="0" t="0"/>
-            <wp:docPr descr="Figure 1. (A) Number of species and (B) vocal activity (number of detections) by habitat and group (confidence ≥ 0.5). Richness is similar between habitats; vocal activity is not true abundance (one individual may sing more in one habitat)." title="" id="31" name="Picture"/>
+            <wp:docPr descr="Figure 1. (A) Species richness and (B) vocal activity (detections) by habitat and group." title="" id="31" name="Picture"/>
             <a:graphic>
               <a:graphicData uri="http://schemas.openxmlformats.org/drawingml/2006/picture">
                 <pic:pic>
@@ -5968,7 +6670,7 @@
         <w:pStyle w:val="ImageCaption"/>
       </w:pPr>
       <w:r>
-        <w:t xml:space="preserve">Figure 1. (A) Number of species and (B) vocal activity (number of detections) by habitat and group (confidence ≥ 0.5). Richness is similar between habitats; vocal activity is not true abundance (one individual may sing more in one habitat).</w:t>
+        <w:t xml:space="preserve">Figure 1. (A) Species richness and (B) vocal activity (detections) by habitat and group.</w:t>
       </w:r>
     </w:p>
     <w:bookmarkEnd w:id="33"/>
@@ -6039,7 +6741,7 @@
           <wp:inline>
             <wp:extent cx="5334000" cy="3352799"/>
             <wp:effectExtent b="0" l="0" r="0" t="0"/>
-            <wp:docPr descr="Figure 2. Community difference (Bray–Curtis, activity-weighted) vs distance between recorders (≤60 m), forest vs pasture. Line = mixed-model fit; band = 95% CI; points adjusted for the day random effect; symbol = replicate day." title="" id="35" name="Picture"/>
+            <wp:docPr descr="Figure 2. Bray–Curtis community dissimilarity vs distance, forest vs pasture (≤60 m)." title="" id="35" name="Picture"/>
             <a:graphic>
               <a:graphicData uri="http://schemas.openxmlformats.org/drawingml/2006/picture">
                 <pic:pic>
@@ -6082,7 +6784,7 @@
         <w:pStyle w:val="ImageCaption"/>
       </w:pPr>
       <w:r>
-        <w:t xml:space="preserve">Figure 2. Community difference (Bray–Curtis, activity-weighted) vs distance between recorders (≤60 m), forest vs pasture. Line = mixed-model fit; band = 95% CI; points adjusted for the day random effect; symbol = replicate day.</w:t>
+        <w:t xml:space="preserve">Figure 2. Bray–Curtis community dissimilarity vs distance, forest vs pasture (≤60 m).</w:t>
       </w:r>
     </w:p>
     <w:p>
@@ -6094,7 +6796,7 @@
           <wp:inline>
             <wp:extent cx="5334000" cy="3352799"/>
             <wp:effectExtent b="0" l="0" r="0" t="0"/>
-            <wp:docPr descr="Figure 3. Species turnover (Jaccard, presence/absence) vs distance (≤60 m). Same model and symbols as Figure 2." title="" id="38" name="Picture"/>
+            <wp:docPr descr="Figure 3. Jaccard species turnover vs distance (≤60 m)." title="" id="38" name="Picture"/>
             <a:graphic>
               <a:graphicData uri="http://schemas.openxmlformats.org/drawingml/2006/picture">
                 <pic:pic>
@@ -6137,7 +6839,7 @@
         <w:pStyle w:val="ImageCaption"/>
       </w:pPr>
       <w:r>
-        <w:t xml:space="preserve">Figure 3. Species turnover (Jaccard, presence/absence) vs distance (≤60 m). Same model and symbols as Figure 2.</w:t>
+        <w:t xml:space="preserve">Figure 3. Jaccard species turnover vs distance (≤60 m).</w:t>
       </w:r>
     </w:p>
     <w:p xmlns:w="http://schemas.openxmlformats.org/wordprocessingml/2006/main" xmlns:wp="http://schemas.openxmlformats.org/drawingml/2006/wordprocessingDrawing" xmlns:r="http://schemas.openxmlformats.org/officeDocument/2006/relationships" xmlns:w14="http://schemas.microsoft.com/office/word/2010/wordml">
@@ -6155,7 +6857,7 @@
         <w:ind w:left="60" w:right="60" w:firstLine="0" w:firstLineChars="0"/>
       </w:pPr>
       <w:r>
-        <w:t xml:space="preserve">Table 3. Distance effect on community difference, by habitat (mixed model, ≤60 m). 'Δ/+10m' = how much dissimilarity changes per extra 10 m; 'CI low/high' = the 95% range; 'CI excl 0' = yes means the effect is statistically clear; n = number of recorder pairs.</w:t>
+        <w:t xml:space="preserve">Table 3. Distance effect on community dissimilarity by habitat (mixed model, ≤60 m).</w:t>
       </w:r>
     </w:p>
     <w:tbl xmlns:w="http://schemas.openxmlformats.org/wordprocessingml/2006/main" xmlns:r="http://schemas.openxmlformats.org/officeDocument/2006/relationships" xmlns:w14="http://schemas.microsoft.com/office/word/2010/wordml" xmlns:wp="http://schemas.openxmlformats.org/drawingml/2006/wordprocessingDrawing" xmlns:a="http://schemas.openxmlformats.org/drawingml/2006/main" xmlns:pic="http://schemas.openxmlformats.org/drawingml/2006/picture">
@@ -8357,17 +9059,7 @@
         <w:pStyle w:val="BodyText"/>
       </w:pPr>
       <w:r>
-        <w:rPr>
-          <w:b/>
-          <w:bCs/>
-        </w:rPr>
-        <w:t xml:space="preserve">How to read Table 3:</w:t>
-      </w:r>
-      <w:r>
-        <w:t xml:space="preserve"> </w:t>
-      </w:r>
-      <w:r>
-        <w:t xml:space="preserve">the column</w:t>
+        <w:t xml:space="preserve">In Table 3, the column</w:t>
       </w:r>
       <w:r>
         <w:t xml:space="preserve"> </w:t>
@@ -8383,13 +9075,13 @@
         <w:t xml:space="preserve"> </w:t>
       </w:r>
       <w:r>
-        <w:t xml:space="preserve">is the effect size — how much more different two</w:t>
-      </w:r>
-      <w:r>
-        <w:t xml:space="preserve"> </w:t>
-      </w:r>
-      <w:r>
-        <w:t xml:space="preserve">recorders become for every extra 10 m apart (a positive number = distance-decay). The</w:t>
+        <w:t xml:space="preserve">is the effect size: how much more different two recorders become for</w:t>
+      </w:r>
+      <w:r>
+        <w:t xml:space="preserve"> </w:t>
+      </w:r>
+      <w:r>
+        <w:t xml:space="preserve">every extra 10 m apart, where a positive number means distance-decay. The</w:t>
       </w:r>
       <w:r>
         <w:t xml:space="preserve"> </w:t>
@@ -8399,62 +9091,41 @@
           <w:b/>
           <w:bCs/>
         </w:rPr>
-        <w:t xml:space="preserve">CI low / CI</w:t>
+        <w:t xml:space="preserve">CI low / CI high</w:t>
+      </w:r>
+      <w:r>
+        <w:t xml:space="preserve"> </w:t>
+      </w:r>
+      <w:r>
+        <w:t xml:space="preserve">columns</w:t>
+      </w:r>
+      <w:r>
+        <w:t xml:space="preserve"> </w:t>
+      </w:r>
+      <w:r>
+        <w:t xml:space="preserve">give the plausible range, and</w:t>
+      </w:r>
+      <w:r>
+        <w:t xml:space="preserve"> </w:t>
       </w:r>
       <w:r>
         <w:rPr>
           <w:b/>
           <w:bCs/>
         </w:rPr>
-        <w:t xml:space="preserve"> </w:t>
-      </w:r>
-      <w:r>
-        <w:rPr>
-          <w:b/>
-          <w:bCs/>
-        </w:rPr>
-        <w:t xml:space="preserve">high</w:t>
-      </w:r>
-      <w:r>
-        <w:t xml:space="preserve"> </w:t>
-      </w:r>
-      <w:r>
-        <w:t xml:space="preserve">columns give the plausible range; when the column</w:t>
-      </w:r>
-      <w:r>
-        <w:t xml:space="preserve"> </w:t>
-      </w:r>
-      <w:r>
-        <w:rPr>
-          <w:b/>
-          <w:bCs/>
-        </w:rPr>
-        <w:t xml:space="preserve">CI excl 0</w:t>
-      </w:r>
-      <w:r>
-        <w:t xml:space="preserve"> </w:t>
-      </w:r>
-      <w:r>
-        <w:t xml:space="preserve">says</w:t>
-      </w:r>
-      <w:r>
-        <w:t xml:space="preserve"> </w:t>
-      </w:r>
-      <w:r>
-        <w:rPr>
-          <w:b/>
-          <w:bCs/>
-        </w:rPr>
-        <w:t xml:space="preserve">yes</w:t>
-      </w:r>
-      <w:r>
-        <w:t xml:space="preserve">, the effect is</w:t>
-      </w:r>
-      <w:r>
-        <w:t xml:space="preserve"> </w:t>
-      </w:r>
-      <w:r>
-        <w:t xml:space="preserve">statistically clear (the range does not include zero).</w:t>
+        <w:t xml:space="preserve">CI excl 0 = yes</w:t>
+      </w:r>
+      <w:r>
+        <w:t xml:space="preserve"> </w:t>
+      </w:r>
+      <w:r>
+        <w:t xml:space="preserve">means the effect is statistically clear (the range</w:t>
+      </w:r>
+      <w:r>
+        <w:t xml:space="preserve"> </w:t>
+      </w:r>
+      <w:r>
+        <w:t xml:space="preserve">does not include zero).</w:t>
       </w:r>
     </w:p>
     <w:p>
@@ -8497,10 +9168,7 @@
         <w:t xml:space="preserve">clear</w:t>
       </w:r>
       <w:r>
-        <w:t xml:space="preserve"> </w:t>
-      </w:r>
-      <w:r>
-        <w:t xml:space="preserve">— Bray–Curtis +0.099 per +10 m (CI +0.028 to +0.169) and Jaccard</w:t>
+        <w:t xml:space="preserve">, Bray–Curtis +0.099 per +10 m (CI +0.028 to +0.169) and Jaccard</w:t>
       </w:r>
       <w:r>
         <w:t xml:space="preserve"> </w:t>
@@ -8567,10 +9235,7 @@
         <w:t xml:space="preserve">unresolved in forest</w:t>
       </w:r>
       <w:r>
-        <w:t xml:space="preserve"> </w:t>
-      </w:r>
-      <w:r>
-        <w:t xml:space="preserve">— the</w:t>
+        <w:t xml:space="preserve">, the</w:t>
       </w:r>
       <w:r>
         <w:t xml:space="preserve"> </w:t>
@@ -8613,7 +9278,7 @@
         <w:ind w:left="60" w:right="60" w:firstLine="0" w:firstLineChars="0"/>
       </w:pPr>
       <w:r>
-        <w:t xml:space="preserve">Table 4. Does the pasture result depend on the confidence cut-off? Jaccard distance slope at three BirdNET confidence thresholds (≤60 m).</w:t>
+        <w:t xml:space="preserve">Table 4. Jaccard distance slope at three confidence thresholds (≤60 m).</w:t>
       </w:r>
     </w:p>
     <w:tbl xmlns:w="http://schemas.openxmlformats.org/wordprocessingml/2006/main" xmlns:r="http://schemas.openxmlformats.org/officeDocument/2006/relationships" xmlns:w14="http://schemas.microsoft.com/office/word/2010/wordml" xmlns:wp="http://schemas.openxmlformats.org/drawingml/2006/wordprocessingDrawing" xmlns:a="http://schemas.openxmlformats.org/drawingml/2006/main" xmlns:pic="http://schemas.openxmlformats.org/drawingml/2006/picture">
@@ -11353,7 +12018,7 @@
         <w:t xml:space="preserve"> </w:t>
       </w:r>
       <w:r>
-        <w:t xml:space="preserve">threshold (0.25, 0.5, 0.7 —</w:t>
+        <w:t xml:space="preserve">threshold (0.25, 0.5, 0.7,</w:t>
       </w:r>
       <w:r>
         <w:t xml:space="preserve"> </w:t>
@@ -11421,7 +12086,7 @@
         <w:ind w:left="60" w:right="60" w:firstLine="0" w:firstLineChars="0"/>
       </w:pPr>
       <w:r>
-        <w:t xml:space="preserve">Table 5. Does habitat change the decay rate? Forest − pasture difference in the distance slope (per +10 m) with 95% CI. A positive number would mean forest decays faster (our prediction P2).</w:t>
+        <w:t xml:space="preserve">Table 5. Forest − pasture difference in distance slope (per +10 m), with 95% CI.</w:t>
       </w:r>
     </w:p>
     <w:tbl xmlns:w="http://schemas.openxmlformats.org/wordprocessingml/2006/main" xmlns:r="http://schemas.openxmlformats.org/officeDocument/2006/relationships" xmlns:w14="http://schemas.microsoft.com/office/word/2010/wordml" xmlns:wp="http://schemas.openxmlformats.org/drawingml/2006/wordprocessingDrawing" xmlns:a="http://schemas.openxmlformats.org/drawingml/2006/main" xmlns:pic="http://schemas.openxmlformats.org/drawingml/2006/picture">
@@ -12286,10 +12951,7 @@
         <w:t xml:space="preserve">negative</w:t>
       </w:r>
       <w:r>
-        <w:t xml:space="preserve"> </w:t>
-      </w:r>
-      <w:r>
-        <w:t xml:space="preserve">— meaning</w:t>
+        <w:t xml:space="preserve">, meaning</w:t>
       </w:r>
       <w:r>
         <w:t xml:space="preserve"> </w:t>
@@ -12385,7 +13047,7 @@
         <w:ind w:left="60" w:right="60" w:firstLine="0" w:firstLineChars="0"/>
       </w:pPr>
       <w:r>
-        <w:t xml:space="preserve">Table 6. Do the acoustic indices change with distance? For each index, how much the difference between two recorders changes per +10 m, with 95% CI (mixed model, ≤60 m). 'dACI/dBI/dADI' = the difference in ACI/BI/ADI between the two recorders.</w:t>
+        <w:t xml:space="preserve">Table 6. Distance effect on each acoustic index difference (mixed model, ≤60 m).</w:t>
       </w:r>
     </w:p>
     <w:tbl xmlns:w="http://schemas.openxmlformats.org/wordprocessingml/2006/main" xmlns:r="http://schemas.openxmlformats.org/officeDocument/2006/relationships" xmlns:w14="http://schemas.microsoft.com/office/word/2010/wordml" xmlns:wp="http://schemas.openxmlformats.org/drawingml/2006/wordprocessingDrawing" xmlns:a="http://schemas.openxmlformats.org/drawingml/2006/main" xmlns:pic="http://schemas.openxmlformats.org/drawingml/2006/picture">
@@ -15461,63 +16123,35 @@
         <w:pStyle w:val="FirstParagraph"/>
       </w:pPr>
       <w:r>
+        <w:t xml:space="preserve">Table 6 applies the same test to the indices: for each one (ACI, BI, ADI) we measured how different two</w:t>
+      </w:r>
+      <w:r>
+        <w:t xml:space="preserve"> </w:t>
+      </w:r>
+      <w:r>
+        <w:t xml:space="preserve">recorders’ values are and whether that difference grows with distance. If an index captured the spatial</w:t>
+      </w:r>
+      <w:r>
+        <w:t xml:space="preserve"> </w:t>
+      </w:r>
+      <w:r>
+        <w:t xml:space="preserve">pattern, its</w:t>
+      </w:r>
+      <w:r>
+        <w:t xml:space="preserve"> </w:t>
+      </w:r>
+      <w:r>
         <w:rPr>
           <w:b/>
           <w:bCs/>
         </w:rPr>
-        <w:t xml:space="preserve">How to read Table 6:</w:t>
-      </w:r>
-      <w:r>
-        <w:t xml:space="preserve"> </w:t>
-      </w:r>
-      <w:r>
-        <w:t xml:space="preserve">for each index (ACI, BI, ADI) we measured how</w:t>
-      </w:r>
-      <w:r>
-        <w:t xml:space="preserve"> </w:t>
-      </w:r>
-      <w:r>
-        <w:rPr>
-          <w:i/>
-          <w:iCs/>
-        </w:rPr>
-        <w:t xml:space="preserve">different</w:t>
-      </w:r>
-      <w:r>
-        <w:t xml:space="preserve"> </w:t>
-      </w:r>
-      <w:r>
-        <w:t xml:space="preserve">two recorders’ index</w:t>
-      </w:r>
-      <w:r>
-        <w:t xml:space="preserve"> </w:t>
-      </w:r>
-      <w:r>
-        <w:t xml:space="preserve">values are, and tested whether that difference grows with distance — exactly the same question as for</w:t>
-      </w:r>
-      <w:r>
-        <w:t xml:space="preserve"> </w:t>
-      </w:r>
-      <w:r>
-        <w:t xml:space="preserve">the species community, but using the cheap indices instead of species. If an index captured the spatial</w:t>
-      </w:r>
-      <w:r>
-        <w:t xml:space="preserve"> </w:t>
-      </w:r>
-      <w:r>
-        <w:t xml:space="preserve">pattern, its</w:t>
-      </w:r>
-      <w:r>
-        <w:t xml:space="preserve"> </w:t>
-      </w:r>
-      <w:r>
-        <w:t xml:space="preserve">“CI excl 0”</w:t>
-      </w:r>
-      <w:r>
-        <w:t xml:space="preserve"> </w:t>
-      </w:r>
-      <w:r>
-        <w:t xml:space="preserve">would say</w:t>
+        <w:t xml:space="preserve">CI excl 0</w:t>
+      </w:r>
+      <w:r>
+        <w:t xml:space="preserve"> </w:t>
+      </w:r>
+      <w:r>
+        <w:t xml:space="preserve">would read</w:t>
       </w:r>
       <w:r>
         <w:t xml:space="preserve"> </w:t>
@@ -15530,7 +16164,7 @@
         <w:t xml:space="preserve">yes</w:t>
       </w:r>
       <w:r>
-        <w:t xml:space="preserve">. Here</w:t>
+        <w:t xml:space="preserve">; here every row reads</w:t>
       </w:r>
       <w:r>
         <w:t xml:space="preserve"> </w:t>
@@ -15540,57 +16174,25 @@
           <w:b/>
           <w:bCs/>
         </w:rPr>
-        <w:t xml:space="preserve">every row says no</w:t>
-      </w:r>
-      <w:r>
-        <w:t xml:space="preserve"> </w:t>
-      </w:r>
-      <w:r>
-        <w:t xml:space="preserve">(all CIs include zero): the</w:t>
-      </w:r>
-      <w:r>
-        <w:t xml:space="preserve"> </w:t>
-      </w:r>
-      <w:r>
-        <w:t xml:space="preserve">indices do</w:t>
-      </w:r>
-      <w:r>
-        <w:t xml:space="preserve"> </w:t>
-      </w:r>
-      <w:r>
-        <w:rPr>
-          <w:b/>
-          <w:bCs/>
-        </w:rPr>
-        <w:t xml:space="preserve">not</w:t>
-      </w:r>
-      <w:r>
-        <w:t xml:space="preserve"> </w:t>
-      </w:r>
-      <w:r>
-        <w:t xml:space="preserve">change with distance. In short, the indices are</w:t>
-      </w:r>
-      <w:r>
-        <w:t xml:space="preserve"> </w:t>
-      </w:r>
-      <w:r>
-        <w:rPr>
-          <w:b/>
-          <w:bCs/>
-        </w:rPr>
-        <w:t xml:space="preserve">flat</w:t>
-      </w:r>
-      <w:r>
-        <w:t xml:space="preserve"> </w:t>
-      </w:r>
-      <w:r>
-        <w:t xml:space="preserve">(Figure 4) — they miss the</w:t>
-      </w:r>
-      <w:r>
-        <w:t xml:space="preserve"> </w:t>
-      </w:r>
-      <w:r>
-        <w:t xml:space="preserve">spatial signal that the species community shows.</w:t>
+        <w:t xml:space="preserve">no</w:t>
+      </w:r>
+      <w:r>
+        <w:t xml:space="preserve"> </w:t>
+      </w:r>
+      <w:r>
+        <w:t xml:space="preserve">(all CIs include zero), so</w:t>
+      </w:r>
+      <w:r>
+        <w:t xml:space="preserve"> </w:t>
+      </w:r>
+      <w:r>
+        <w:t xml:space="preserve">the indices do not change with distance. They are flat (Figure 4) and miss the spatial signal that the</w:t>
+      </w:r>
+      <w:r>
+        <w:t xml:space="preserve"> </w:t>
+      </w:r>
+      <w:r>
+        <w:t xml:space="preserve">species community shows.</w:t>
       </w:r>
     </w:p>
     <w:p>
@@ -15602,7 +16204,7 @@
           <wp:inline>
             <wp:extent cx="5334000" cy="2247194"/>
             <wp:effectExtent b="0" l="0" r="0" t="0"/>
-            <wp:docPr descr="Figure 4. Difference in each acoustic index (ACI, BI, ADI) between two recorders vs distance (≤60 m). All three lines are flat — no index changes with distance (none has a CI that excludes zero)." title="" id="44" name="Picture"/>
+            <wp:docPr descr="Figure 4. Difference in each acoustic index vs distance, forest vs pasture (≤60 m)." title="" id="44" name="Picture"/>
             <a:graphic>
               <a:graphicData uri="http://schemas.openxmlformats.org/drawingml/2006/picture">
                 <pic:pic>
@@ -15645,7 +16247,7 @@
         <w:pStyle w:val="ImageCaption"/>
       </w:pPr>
       <w:r>
-        <w:t xml:space="preserve">Figure 4. Difference in each acoustic index (ACI, BI, ADI) between two recorders vs distance (≤60 m). All three lines are flat — no index changes with distance (none has a CI that excludes zero).</w:t>
+        <w:t xml:space="preserve">Figure 4. Difference in each acoustic index vs distance, forest vs pasture (≤60 m).</w:t>
       </w:r>
     </w:p>
     <w:p>
@@ -15666,10 +16268,7 @@
         <w:t xml:space="preserve">none of the acoustic indices shows a distance-decay</w:t>
       </w:r>
       <w:r>
-        <w:t xml:space="preserve"> </w:t>
-      </w:r>
-      <w:r>
-        <w:t xml:space="preserve">— ACI, BI and ADI all have CIs</w:t>
+        <w:t xml:space="preserve">, ACI, BI and ADI all have CIs</w:t>
       </w:r>
       <w:r>
         <w:t xml:space="preserve"> </w:t>
@@ -15697,25 +16296,19 @@
         <w:t xml:space="preserve"> </w:t>
       </w:r>
       <w:r>
-        <w:t xml:space="preserve">species community resolves in pasture (P4 not supported). (In an earlier version that kept the lone</w:t>
-      </w:r>
-      <w:r>
-        <w:t xml:space="preserve"> </w:t>
-      </w:r>
-      <w:r>
-        <w:t xml:space="preserve">120 m pasture pair, ADI appeared significant; that signal came entirely from that single unusual</w:t>
-      </w:r>
-      <w:r>
-        <w:t xml:space="preserve"> </w:t>
-      </w:r>
-      <w:r>
-        <w:t xml:space="preserve">point and vanished once it was removed — a reminder to distrust an effect that hinges on one</w:t>
-      </w:r>
-      <w:r>
-        <w:t xml:space="preserve"> </w:t>
-      </w:r>
-      <w:r>
-        <w:t xml:space="preserve">observation.)</w:t>
+        <w:t xml:space="preserve">species community resolves in pasture (P4 not supported). Including the single 120 m pasture pair would</w:t>
+      </w:r>
+      <w:r>
+        <w:t xml:space="preserve"> </w:t>
+      </w:r>
+      <w:r>
+        <w:t xml:space="preserve">produce an apparent ADI signal, but that signal depends entirely on that one unreplicated point, which</w:t>
+      </w:r>
+      <w:r>
+        <w:t xml:space="preserve"> </w:t>
+      </w:r>
+      <w:r>
+        <w:t xml:space="preserve">is why it was excluded (Methods).</w:t>
       </w:r>
     </w:p>
     <w:bookmarkEnd w:id="46"/>
@@ -15751,7 +16344,7 @@
           <wp:inline>
             <wp:extent cx="5334000" cy="2012597"/>
             <wp:effectExtent b="0" l="0" r="0" t="0"/>
-            <wp:docPr descr="Figure 5. How the three acoustic indices change through the day (mean ± 95% CI), forest vs pasture. BI peaks at dawn/day (the chorus); ADI dips at midday; pasture reads louder than forest." title="" id="48" name="Picture"/>
+            <wp:docPr descr="Figure 5. Diel variation of ACI, BI and ADI by habitat (mean ± 95% CI)." title="" id="48" name="Picture"/>
             <a:graphic>
               <a:graphicData uri="http://schemas.openxmlformats.org/drawingml/2006/picture">
                 <pic:pic>
@@ -15794,7 +16387,7 @@
         <w:pStyle w:val="ImageCaption"/>
       </w:pPr>
       <w:r>
-        <w:t xml:space="preserve">Figure 5. How the three acoustic indices change through the day (mean ± 95% CI), forest vs pasture. BI peaks at dawn/day (the chorus); ADI dips at midday; pasture reads louder than forest.</w:t>
+        <w:t xml:space="preserve">Figure 5. Diel variation of ACI, BI and ADI by habitat (mean ± 95% CI).</w:t>
       </w:r>
     </w:p>
     <w:p>
@@ -15847,10 +16440,7 @@
         <w:t xml:space="preserve">dawn and day</w:t>
       </w:r>
       <w:r>
-        <w:t xml:space="preserve"> </w:t>
-      </w:r>
-      <w:r>
-        <w:t xml:space="preserve">— the dawn chorus — and falls at night;</w:t>
+        <w:t xml:space="preserve">, the dawn chorus, and falls at night;</w:t>
       </w:r>
       <w:r>
         <w:t xml:space="preserve"> </w:t>
@@ -15943,7 +16533,7 @@
         <w:t xml:space="preserve"> </w:t>
       </w:r>
       <w:r>
-        <w:t xml:space="preserve">signal well (P3 supported) — which is why time of day must be balanced when comparing</w:t>
+        <w:t xml:space="preserve">signal well (P3 supported), which is why time of day must be balanced when comparing</w:t>
       </w:r>
       <w:r>
         <w:t xml:space="preserve"> </w:t>
@@ -15971,7 +16561,7 @@
           <wp:inline>
             <wp:extent cx="5334000" cy="2129895"/>
             <wp:effectExtent b="0" l="0" r="0" t="0"/>
-            <wp:docPr descr="Figure 6. Average temperature and relative humidity by hour of day (loggers, June 3–7). The forest stays cooler and more humid; the pasture heats up and dries out at midday." title="" id="52" name="Picture"/>
+            <wp:docPr descr="Figure 6. Mean temperature and humidity by hour, forest vs pasture (June 3–7)." title="" id="52" name="Picture"/>
             <a:graphic>
               <a:graphicData uri="http://schemas.openxmlformats.org/drawingml/2006/picture">
                 <pic:pic>
@@ -16014,7 +16604,7 @@
         <w:pStyle w:val="ImageCaption"/>
       </w:pPr>
       <w:r>
-        <w:t xml:space="preserve">Figure 6. Average temperature and relative humidity by hour of day (loggers, June 3–7). The forest stays cooler and more humid; the pasture heats up and dries out at midday.</w:t>
+        <w:t xml:space="preserve">Figure 6. Mean temperature and humidity by hour, forest vs pasture (June 3–7).</w:t>
       </w:r>
     </w:p>
     <w:p xmlns:w="http://schemas.openxmlformats.org/wordprocessingml/2006/main" xmlns:wp="http://schemas.openxmlformats.org/drawingml/2006/wordprocessingDrawing" xmlns:r="http://schemas.openxmlformats.org/officeDocument/2006/relationships" xmlns:w14="http://schemas.microsoft.com/office/word/2010/wordml">
@@ -16032,7 +16622,7 @@
         <w:ind w:left="60" w:right="60" w:firstLine="0" w:firstLineChars="0"/>
       </w:pPr>
       <w:r>
-        <w:t xml:space="preserve">Table 7. Microclimate summary for the study window. Forest is cooler and far more often near 100% humidity than pasture.</w:t>
+        <w:t xml:space="preserve">Table 7. Microclimate summary by habitat (study window).</w:t>
       </w:r>
     </w:p>
     <w:tbl xmlns:w="http://schemas.openxmlformats.org/wordprocessingml/2006/main" xmlns:r="http://schemas.openxmlformats.org/officeDocument/2006/relationships" xmlns:w14="http://schemas.microsoft.com/office/word/2010/wordml" xmlns:wp="http://schemas.openxmlformats.org/drawingml/2006/wordprocessingDrawing" xmlns:a="http://schemas.openxmlformats.org/drawingml/2006/main" xmlns:pic="http://schemas.openxmlformats.org/drawingml/2006/picture">
@@ -17001,7 +17591,7 @@
           <w:b/>
           <w:bCs/>
         </w:rPr>
-        <w:t xml:space="preserve">are spaced farther apart — in the open pasture</w:t>
+        <w:t xml:space="preserve">are spaced farther apart, in the open pasture</w:t>
       </w:r>
       <w:r>
         <w:t xml:space="preserve"> </w:t>
@@ -17068,7 +17658,7 @@
         <w:t xml:space="preserve"> </w:t>
       </w:r>
       <w:r>
-        <w:t xml:space="preserve">in pasture. The mechanistic expectation (forest attenuates sound → faster decay) is not borne out. A</w:t>
+        <w:t xml:space="preserve">in pasture. The mechanistic expectation (forest attenuates sound, giving faster decay) is not borne out. A</w:t>
       </w:r>
       <w:r>
         <w:t xml:space="preserve"> </w:t>
@@ -17090,13 +17680,13 @@
         <w:t xml:space="preserve"> </w:t>
       </w:r>
       <w:r>
-        <w:t xml:space="preserve">habitat —</w:t>
-      </w:r>
-      <w:r>
-        <w:t xml:space="preserve"> </w:t>
-      </w:r>
-      <w:r>
-        <w:t xml:space="preserve">patchy edges, scattered shrubs, localised clusters of callers — so neighbouring pasture recorders</w:t>
+        <w:t xml:space="preserve">habitat,</w:t>
+      </w:r>
+      <w:r>
+        <w:t xml:space="preserve"> </w:t>
+      </w:r>
+      <w:r>
+        <w:t xml:space="preserve">patchy edges, scattered shrubs, localised clusters of callers, so neighbouring pasture recorders</w:t>
       </w:r>
       <w:r>
         <w:t xml:space="preserve"> </w:t>
@@ -17225,7 +17815,7 @@
         <w:t xml:space="preserve"> </w:t>
       </w:r>
       <w:r>
-        <w:t xml:space="preserve">them unmoved. The lesson is direct —</w:t>
+        <w:t xml:space="preserve">them unmoved. The lesson is direct,</w:t>
       </w:r>
       <w:r>
         <w:t xml:space="preserve"> </w:t>
@@ -17282,7 +17872,7 @@
         <w:t xml:space="preserve"> </w:t>
       </w:r>
       <w:r>
-        <w:t xml:space="preserve">(P3 — the dawn/day</w:t>
+        <w:t xml:space="preserve">(P3, the dawn/day</w:t>
       </w:r>
       <w:r>
         <w:t xml:space="preserve"> </w:t>
@@ -17330,7 +17920,7 @@
           <w:b/>
           <w:bCs/>
         </w:rPr>
-        <w:t xml:space="preserve">different as the recorders are spaced farther apart — in the open pasture</w:t>
+        <w:t xml:space="preserve">different as the recorders are spaced farther apart, in the open pasture</w:t>
       </w:r>
       <w:r>
         <w:t xml:space="preserve">, a distance-decay robust</w:t>
@@ -17399,7 +17989,7 @@
         <w:t xml:space="preserve"> </w:t>
       </w:r>
       <w:r>
-        <w:t xml:space="preserve">indices alone — although the indices cleanly capture the</w:t>
+        <w:t xml:space="preserve">indices alone, although the indices cleanly capture the</w:t>
       </w:r>
       <w:r>
         <w:t xml:space="preserve"> </w:t>

</xml_diff>

<commit_message>
Review round 2: data window, model formula, clarify 'steeper', reword rationale
- Data collection: analysis window 11:00-9:40, discard setup/relocation/shuffle period
- Replace dissimilarity formulas with the statistical model formula (Response ~ Distance x Habitat + (1|day)) plus the diel model
- Clarify 'steeper' = dissimilarity rises faster with distance (larger slope), not terrain
- Reword effect-size rationale as a scientific choice, not 'course emphasis'

Co-Authored-By: Claude Opus 4.8 <noreply@anthropic.com>
</commit_message>
<xml_diff>
--- a/reports/tandayapa_spacing_report.docx
+++ b/reports/tandayapa_spacing_report.docx
@@ -414,7 +414,7 @@
         <w:t xml:space="preserve"> </w:t>
       </w:r>
       <w:r>
-        <w:t xml:space="preserve">The increase is steeper in</w:t>
+        <w:t xml:space="preserve">Dissimilarity increases</w:t>
       </w:r>
       <w:r>
         <w:t xml:space="preserve"> </w:t>
@@ -424,19 +424,29 @@
           <w:b/>
           <w:bCs/>
         </w:rPr>
+        <w:t xml:space="preserve">faster with distance</w:t>
+      </w:r>
+      <w:r>
+        <w:t xml:space="preserve"> </w:t>
+      </w:r>
+      <w:r>
+        <w:t xml:space="preserve">in</w:t>
+      </w:r>
+      <w:r>
+        <w:t xml:space="preserve"> </w:t>
+      </w:r>
+      <w:r>
+        <w:rPr>
+          <w:b/>
+          <w:bCs/>
+        </w:rPr>
         <w:t xml:space="preserve">forest</w:t>
       </w:r>
       <w:r>
         <w:t xml:space="preserve"> </w:t>
       </w:r>
       <w:r>
-        <w:t xml:space="preserve">than pasture (forest</w:t>
-      </w:r>
-      <w:r>
-        <w:t xml:space="preserve"> </w:t>
-      </w:r>
-      <w:r>
-        <w:t xml:space="preserve">attenuates sound, creating more localised soundscapes).</w:t>
+        <w:t xml:space="preserve">than pasture (forest attenuates sound, creating more localised soundscapes).</w:t>
       </w:r>
     </w:p>
     <w:p>
@@ -3786,7 +3796,7 @@
         <w:pStyle w:val="FirstParagraph"/>
       </w:pPr>
       <w:r>
-        <w:t xml:space="preserve">Each AudioMoth recorded from</w:t>
+        <w:t xml:space="preserve">For analysis we used the window from</w:t>
       </w:r>
       <w:r>
         <w:t xml:space="preserve"> </w:t>
@@ -3796,10 +3806,22 @@
           <w:b/>
           <w:bCs/>
         </w:rPr>
-        <w:t xml:space="preserve">10:40 a.m. to 9:40 a.m. the next day</w:t>
-      </w:r>
-      <w:r>
-        <w:t xml:space="preserve">, taking</w:t>
+        <w:t xml:space="preserve">11:00 a.m. to 9:40 a.m. the next day</w:t>
+      </w:r>
+      <w:r>
+        <w:t xml:space="preserve">, discarding the</w:t>
+      </w:r>
+      <w:r>
+        <w:t xml:space="preserve"> </w:t>
+      </w:r>
+      <w:r>
+        <w:t xml:space="preserve">surrounding period when recorders were being placed, collected, and swapped between positions, so that</w:t>
+      </w:r>
+      <w:r>
+        <w:t xml:space="preserve"> </w:t>
+      </w:r>
+      <w:r>
+        <w:t xml:space="preserve">handling and movement were not counted as data. Within this window each recorder took</w:t>
       </w:r>
       <w:r>
         <w:t xml:space="preserve"> </w:t>
@@ -3835,7 +3857,7 @@
         <w:t xml:space="preserve"> </w:t>
       </w:r>
       <w:r>
-        <w:t xml:space="preserve">spanning the full day–night cycle (Ross et al., 2023). Data were downloaded in the field after each</w:t>
+        <w:t xml:space="preserve">covering the full day–night cycle (Ross et al., 2023). Data were downloaded in the field after each</w:t>
       </w:r>
       <w:r>
         <w:t xml:space="preserve"> </w:t>
@@ -4605,7 +4627,13 @@
         <w:t xml:space="preserve">lmerTest</w:t>
       </w:r>
       <w:r>
-        <w:t xml:space="preserve">) with the</w:t>
+        <w:t xml:space="preserve">). For each response we fit the</w:t>
+      </w:r>
+      <w:r>
+        <w:t xml:space="preserve"> </w:t>
+      </w:r>
+      <w:r>
+        <w:t xml:space="preserve">same form of model, letting the effect of distance differ between habitats and giving each</w:t>
       </w:r>
       <w:r>
         <w:t xml:space="preserve"> </w:t>
@@ -4615,78 +4643,13 @@
           <w:b/>
           <w:bCs/>
         </w:rPr>
-        <w:t xml:space="preserve">deployment day as</w:t>
-      </w:r>
-      <w:r>
-        <w:rPr>
-          <w:b/>
-          <w:bCs/>
-        </w:rPr>
-        <w:t xml:space="preserve"> </w:t>
-      </w:r>
-      <w:r>
-        <w:rPr>
-          <w:b/>
-          <w:bCs/>
-        </w:rPr>
-        <w:t xml:space="preserve">a random effect</w:t>
-      </w:r>
-      <w:r>
-        <w:t xml:space="preserve">. For a pair of recorders</w:t>
-      </w:r>
-      <w:r>
-        <w:t xml:space="preserve"> </w:t>
-      </w:r>
-      <m:oMath>
-        <m:r>
-          <m:t>i</m:t>
-        </m:r>
-        <m:r>
-          <m:rPr>
-            <m:sty m:val="p"/>
-          </m:rPr>
-          <m:t>,</m:t>
-        </m:r>
-        <m:r>
-          <m:t>j</m:t>
-        </m:r>
-      </m:oMath>
-      <w:r>
-        <w:t xml:space="preserve"> </w:t>
-      </w:r>
-      <w:r>
-        <w:t xml:space="preserve">in habitat</w:t>
-      </w:r>
-      <w:r>
-        <w:t xml:space="preserve"> </w:t>
-      </w:r>
-      <m:oMath>
-        <m:r>
-          <m:t>h</m:t>
-        </m:r>
-      </m:oMath>
-      <w:r>
-        <w:t xml:space="preserve"> </w:t>
-      </w:r>
-      <w:r>
-        <w:t xml:space="preserve">and deployment day</w:t>
-      </w:r>
-      <w:r>
-        <w:t xml:space="preserve"> </w:t>
-      </w:r>
-      <m:oMath>
-        <m:r>
-          <m:t>d</m:t>
-        </m:r>
-      </m:oMath>
-      <w:r>
-        <w:t xml:space="preserve">, the</w:t>
-      </w:r>
-      <w:r>
-        <w:t xml:space="preserve"> </w:t>
-      </w:r>
-      <w:r>
-        <w:t xml:space="preserve">dissimilarity is modelled as a function of the inter-recorder distance:</w:t>
+        <w:t xml:space="preserve">deployment day</w:t>
+      </w:r>
+      <w:r>
+        <w:t xml:space="preserve"> </w:t>
+      </w:r>
+      <w:r>
+        <w:t xml:space="preserve">its own baseline through a random effect:</w:t>
       </w:r>
     </w:p>
     <w:p>
@@ -4698,145 +4661,13 @@
           <m:jc m:val="center"/>
         </m:oMathParaPr>
         <m:oMath>
-          <m:sSub>
-            <m:e>
-              <m:r>
-                <m:t>y</m:t>
-              </m:r>
-            </m:e>
-            <m:sub>
-              <m:r>
-                <m:t>i</m:t>
-              </m:r>
-              <m:r>
-                <m:t>j</m:t>
-              </m:r>
-              <m:r>
-                <m:t>d</m:t>
-              </m:r>
-            </m:sub>
-          </m:sSub>
           <m:r>
             <m:rPr>
+              <m:nor/>
               <m:sty m:val="p"/>
             </m:rPr>
-            <m:t>=</m:t>
+            <m:t>Response</m:t>
           </m:r>
-          <m:sSub>
-            <m:e>
-              <m:r>
-                <m:t>β</m:t>
-              </m:r>
-            </m:e>
-            <m:sub>
-              <m:r>
-                <m:t>0</m:t>
-              </m:r>
-            </m:sub>
-          </m:sSub>
-          <m:r>
-            <m:rPr>
-              <m:sty m:val="p"/>
-            </m:rPr>
-            <m:t>+</m:t>
-          </m:r>
-          <m:sSub>
-            <m:e>
-              <m:r>
-                <m:t>β</m:t>
-              </m:r>
-            </m:e>
-            <m:sub>
-              <m:r>
-                <m:t>1</m:t>
-              </m:r>
-            </m:sub>
-          </m:sSub>
-          <m:r>
-            <m:t> </m:t>
-          </m:r>
-          <m:sSub>
-            <m:e>
-              <m:r>
-                <m:rPr>
-                  <m:nor/>
-                  <m:sty m:val="p"/>
-                </m:rPr>
-                <m:t>distance</m:t>
-              </m:r>
-            </m:e>
-            <m:sub>
-              <m:r>
-                <m:t>i</m:t>
-              </m:r>
-              <m:r>
-                <m:t>j</m:t>
-              </m:r>
-            </m:sub>
-          </m:sSub>
-          <m:r>
-            <m:rPr>
-              <m:sty m:val="p"/>
-            </m:rPr>
-            <m:t>+</m:t>
-          </m:r>
-          <m:sSub>
-            <m:e>
-              <m:r>
-                <m:t>u</m:t>
-              </m:r>
-            </m:e>
-            <m:sub>
-              <m:r>
-                <m:t>d</m:t>
-              </m:r>
-            </m:sub>
-          </m:sSub>
-          <m:r>
-            <m:rPr>
-              <m:sty m:val="p"/>
-            </m:rPr>
-            <m:t>+</m:t>
-          </m:r>
-          <m:sSub>
-            <m:e>
-              <m:r>
-                <m:t>ε</m:t>
-              </m:r>
-            </m:e>
-            <m:sub>
-              <m:r>
-                <m:t>i</m:t>
-              </m:r>
-              <m:r>
-                <m:t>j</m:t>
-              </m:r>
-              <m:r>
-                <m:t>d</m:t>
-              </m:r>
-            </m:sub>
-          </m:sSub>
-          <m:r>
-            <m:rPr>
-              <m:sty m:val="p"/>
-            </m:rPr>
-            <m:t>,</m:t>
-          </m:r>
-          <m:r>
-            <m:t>  </m:t>
-          </m:r>
-          <m:sSub>
-            <m:e>
-              <m:r>
-                <m:t>u</m:t>
-              </m:r>
-            </m:e>
-            <m:sub>
-              <m:r>
-                <m:t>d</m:t>
-              </m:r>
-            </m:sub>
-          </m:sSub>
           <m:r>
             <m:rPr>
               <m:sty m:val="p"/>
@@ -4844,7 +4675,30 @@
             <m:t>∼</m:t>
           </m:r>
           <m:r>
-            <m:t>N</m:t>
+            <m:rPr>
+              <m:nor/>
+              <m:sty m:val="p"/>
+            </m:rPr>
+            <m:t>Distance</m:t>
+          </m:r>
+          <m:r>
+            <m:rPr>
+              <m:sty m:val="p"/>
+            </m:rPr>
+            <m:t>×</m:t>
+          </m:r>
+          <m:r>
+            <m:rPr>
+              <m:nor/>
+              <m:sty m:val="p"/>
+            </m:rPr>
+            <m:t>Habitat</m:t>
+          </m:r>
+          <m:r>
+            <m:rPr>
+              <m:sty m:val="p"/>
+            </m:rPr>
+            <m:t>+</m:t>
           </m:r>
           <m:d>
             <m:dPr>
@@ -4855,31 +4709,21 @@
             </m:dPr>
             <m:e>
               <m:r>
-                <m:t>0</m:t>
+                <m:t>1</m:t>
               </m:r>
               <m:r>
                 <m:rPr>
                   <m:sty m:val="p"/>
                 </m:rPr>
-                <m:t>,</m:t>
+                <m:t>∣</m:t>
               </m:r>
-              <m:sSubSup>
-                <m:e>
-                  <m:r>
-                    <m:t>σ</m:t>
-                  </m:r>
-                </m:e>
-                <m:sub>
-                  <m:r>
-                    <m:t>u</m:t>
-                  </m:r>
-                </m:sub>
-                <m:sup>
-                  <m:r>
-                    <m:t>2</m:t>
-                  </m:r>
-                </m:sup>
-              </m:sSubSup>
+              <m:r>
+                <m:rPr>
+                  <m:nor/>
+                  <m:sty m:val="p"/>
+                </m:rPr>
+                <m:t>day</m:t>
+              </m:r>
             </m:e>
           </m:d>
         </m:oMath>
@@ -4890,98 +4734,173 @@
         <w:pStyle w:val="FirstParagraph"/>
       </w:pPr>
       <w:r>
-        <w:t xml:space="preserve">where</w:t>
-      </w:r>
-      <w:r>
-        <w:t xml:space="preserve"> </w:t>
+        <w:t xml:space="preserve">The response is the community dissimilarity (</w:t>
+      </w:r>
+      <w:r>
+        <w:rPr>
+          <w:b/>
+          <w:bCs/>
+        </w:rPr>
+        <w:t xml:space="preserve">Bray–Curtis</w:t>
+      </w:r>
+      <w:r>
+        <w:t xml:space="preserve">, activity-weighted, or</w:t>
+      </w:r>
+      <w:r>
+        <w:t xml:space="preserve"> </w:t>
+      </w:r>
+      <w:r>
+        <w:rPr>
+          <w:b/>
+          <w:bCs/>
+        </w:rPr>
+        <w:t xml:space="preserve">Jaccard</w:t>
+      </w:r>
+      <w:r>
+        <w:t xml:space="preserve">,</w:t>
+      </w:r>
+      <w:r>
+        <w:t xml:space="preserve"> </w:t>
+      </w:r>
+      <w:r>
+        <w:t xml:space="preserve">presence/absence) or, for the index analysis, the absolute index difference between the two recorders</w:t>
+      </w:r>
+      <w:r>
+        <w:t xml:space="preserve"> </w:t>
+      </w:r>
+      <w:r>
+        <w:t xml:space="preserve">(</w:t>
       </w:r>
       <m:oMath>
-        <m:sSub>
+        <m:r>
+          <m:t>Δ</m:t>
+        </m:r>
+        <m:r>
+          <m:rPr>
+            <m:nor/>
+            <m:sty m:val="p"/>
+          </m:rPr>
+          <m:t>ACI</m:t>
+        </m:r>
+      </m:oMath>
+      <w:r>
+        <w:t xml:space="preserve">,</w:t>
+      </w:r>
+      <w:r>
+        <w:t xml:space="preserve"> </w:t>
+      </w:r>
+      <m:oMath>
+        <m:r>
+          <m:t>Δ</m:t>
+        </m:r>
+        <m:r>
+          <m:rPr>
+            <m:nor/>
+            <m:sty m:val="p"/>
+          </m:rPr>
+          <m:t>BI</m:t>
+        </m:r>
+      </m:oMath>
+      <w:r>
+        <w:t xml:space="preserve">,</w:t>
+      </w:r>
+      <w:r>
+        <w:t xml:space="preserve"> </w:t>
+      </w:r>
+      <m:oMath>
+        <m:r>
+          <m:t>Δ</m:t>
+        </m:r>
+        <m:r>
+          <m:rPr>
+            <m:nor/>
+            <m:sty m:val="p"/>
+          </m:rPr>
+          <m:t>ADI</m:t>
+        </m:r>
+      </m:oMath>
+      <w:r>
+        <w:t xml:space="preserve">). The</w:t>
+      </w:r>
+      <w:r>
+        <w:t xml:space="preserve"> </w:t>
+      </w:r>
+      <m:oMath>
+        <m:r>
+          <m:rPr>
+            <m:nor/>
+            <m:sty m:val="p"/>
+          </m:rPr>
+          <m:t>Distance</m:t>
+        </m:r>
+        <m:r>
+          <m:rPr>
+            <m:sty m:val="p"/>
+          </m:rPr>
+          <m:t>×</m:t>
+        </m:r>
+        <m:r>
+          <m:rPr>
+            <m:nor/>
+            <m:sty m:val="p"/>
+          </m:rPr>
+          <m:t>Habitat</m:t>
+        </m:r>
+      </m:oMath>
+      <w:r>
+        <w:t xml:space="preserve"> </w:t>
+      </w:r>
+      <w:r>
+        <w:t xml:space="preserve">term gives a separate distance slope for forest and pasture, and the difference between those slopes is</w:t>
+      </w:r>
+      <w:r>
+        <w:t xml:space="preserve"> </w:t>
+      </w:r>
+      <w:r>
+        <w:t xml:space="preserve">the habitat effect;</w:t>
+      </w:r>
+      <w:r>
+        <w:t xml:space="preserve"> </w:t>
+      </w:r>
+      <m:oMath>
+        <m:d>
+          <m:dPr>
+            <m:begChr m:val="("/>
+            <m:sepChr m:val=""/>
+            <m:endChr m:val=")"/>
+            <m:grow/>
+          </m:dPr>
           <m:e>
-            <m:r>
-              <m:t>β</m:t>
-            </m:r>
-          </m:e>
-          <m:sub>
             <m:r>
               <m:t>1</m:t>
             </m:r>
-          </m:sub>
-        </m:sSub>
-      </m:oMath>
-      <w:r>
-        <w:t xml:space="preserve"> </w:t>
-      </w:r>
-      <w:r>
-        <w:t xml:space="preserve">is the</w:t>
-      </w:r>
-      <w:r>
-        <w:t xml:space="preserve"> </w:t>
-      </w:r>
-      <w:r>
-        <w:rPr>
-          <w:b/>
-          <w:bCs/>
-        </w:rPr>
-        <w:t xml:space="preserve">effect size</w:t>
-      </w:r>
-      <w:r>
-        <w:t xml:space="preserve"> </w:t>
-      </w:r>
-      <w:r>
-        <w:t xml:space="preserve">(change in dissimilarity per metre, reported per +10 m),</w:t>
-      </w:r>
-      <w:r>
-        <w:t xml:space="preserve"> </w:t>
-      </w:r>
-      <m:oMath>
-        <m:sSub>
-          <m:e>
             <m:r>
-              <m:t>u</m:t>
+              <m:rPr>
+                <m:sty m:val="p"/>
+              </m:rPr>
+              <m:t>∣</m:t>
+            </m:r>
+            <m:r>
+              <m:rPr>
+                <m:nor/>
+                <m:sty m:val="p"/>
+              </m:rPr>
+              <m:t>day</m:t>
             </m:r>
           </m:e>
-          <m:sub>
-            <m:r>
-              <m:t>d</m:t>
-            </m:r>
-          </m:sub>
-        </m:sSub>
+        </m:d>
       </m:oMath>
       <w:r>
         <w:t xml:space="preserve"> </w:t>
       </w:r>
       <w:r>
-        <w:t xml:space="preserve">is</w:t>
-      </w:r>
-      <w:r>
-        <w:t xml:space="preserve"> </w:t>
-      </w:r>
-      <w:r>
-        <w:t xml:space="preserve">the random intercept for each deployment day, and the habitat comparison is the difference in</w:t>
-      </w:r>
-      <w:r>
-        <w:t xml:space="preserve"> </w:t>
-      </w:r>
-      <m:oMath>
-        <m:sSub>
-          <m:e>
-            <m:r>
-              <m:t>β</m:t>
-            </m:r>
-          </m:e>
-          <m:sub>
-            <m:r>
-              <m:t>1</m:t>
-            </m:r>
-          </m:sub>
-        </m:sSub>
-      </m:oMath>
-      <w:r>
-        <w:t xml:space="preserve"> </w:t>
-      </w:r>
-      <w:r>
-        <w:t xml:space="preserve">between forest and pasture. The two community dissimilarities are</w:t>
+        <w:t xml:space="preserve">accounts for the deployment day. Variation through the day is</w:t>
+      </w:r>
+      <w:r>
+        <w:t xml:space="preserve"> </w:t>
+      </w:r>
+      <w:r>
+        <w:t xml:space="preserve">examined with a separate model of index level:</w:t>
       </w:r>
     </w:p>
     <w:p>
@@ -4993,248 +4912,71 @@
           <m:jc m:val="center"/>
         </m:oMathParaPr>
         <m:oMath>
-          <m:sSub>
+          <m:r>
+            <m:rPr>
+              <m:nor/>
+              <m:sty m:val="p"/>
+            </m:rPr>
+            <m:t>Index</m:t>
+          </m:r>
+          <m:r>
+            <m:rPr>
+              <m:sty m:val="p"/>
+            </m:rPr>
+            <m:t>∼</m:t>
+          </m:r>
+          <m:r>
+            <m:rPr>
+              <m:nor/>
+              <m:sty m:val="p"/>
+            </m:rPr>
+            <m:t>Time of day</m:t>
+          </m:r>
+          <m:r>
+            <m:rPr>
+              <m:sty m:val="p"/>
+            </m:rPr>
+            <m:t>×</m:t>
+          </m:r>
+          <m:r>
+            <m:rPr>
+              <m:nor/>
+              <m:sty m:val="p"/>
+            </m:rPr>
+            <m:t>Habitat</m:t>
+          </m:r>
+          <m:r>
+            <m:rPr>
+              <m:sty m:val="p"/>
+            </m:rPr>
+            <m:t>+</m:t>
+          </m:r>
+          <m:d>
+            <m:dPr>
+              <m:begChr m:val="("/>
+              <m:sepChr m:val=""/>
+              <m:endChr m:val=")"/>
+              <m:grow/>
+            </m:dPr>
             <m:e>
+              <m:r>
+                <m:t>1</m:t>
+              </m:r>
+              <m:r>
+                <m:rPr>
+                  <m:sty m:val="p"/>
+                </m:rPr>
+                <m:t>∣</m:t>
+              </m:r>
               <m:r>
                 <m:rPr>
                   <m:nor/>
                   <m:sty m:val="p"/>
                 </m:rPr>
-                <m:t>Bray–Curtis</m:t>
+                <m:t>recorder</m:t>
               </m:r>
             </m:e>
-            <m:sub>
-              <m:r>
-                <m:t>j</m:t>
-              </m:r>
-              <m:r>
-                <m:t>k</m:t>
-              </m:r>
-            </m:sub>
-          </m:sSub>
-          <m:r>
-            <m:rPr>
-              <m:sty m:val="p"/>
-            </m:rPr>
-            <m:t>=</m:t>
-          </m:r>
-          <m:f>
-            <m:fPr>
-              <m:type m:val="bar"/>
-            </m:fPr>
-            <m:num>
-              <m:nary>
-                <m:naryPr>
-                  <m:chr m:val="∑"/>
-                  <m:limLoc m:val="undOvr"/>
-                  <m:subHide m:val="off"/>
-                  <m:supHide m:val="on"/>
-                </m:naryPr>
-                <m:sub>
-                  <m:r>
-                    <m:t>i</m:t>
-                  </m:r>
-                </m:sub>
-                <m:sup>
-                  <m:r>
-                    <m:t>​</m:t>
-                  </m:r>
-                </m:sup>
-                <m:e>
-                  <m:d>
-                    <m:dPr>
-                      <m:begChr m:val="|"/>
-                      <m:sepChr m:val=""/>
-                      <m:endChr m:val="|"/>
-                      <m:grow/>
-                    </m:dPr>
-                    <m:e>
-                      <m:sSub>
-                        <m:e>
-                          <m:r>
-                            <m:t>x</m:t>
-                          </m:r>
-                        </m:e>
-                        <m:sub>
-                          <m:r>
-                            <m:t>i</m:t>
-                          </m:r>
-                          <m:r>
-                            <m:t>j</m:t>
-                          </m:r>
-                        </m:sub>
-                      </m:sSub>
-                      <m:r>
-                        <m:rPr>
-                          <m:sty m:val="p"/>
-                        </m:rPr>
-                        <m:t>−</m:t>
-                      </m:r>
-                      <m:sSub>
-                        <m:e>
-                          <m:r>
-                            <m:t>x</m:t>
-                          </m:r>
-                        </m:e>
-                        <m:sub>
-                          <m:r>
-                            <m:t>i</m:t>
-                          </m:r>
-                          <m:r>
-                            <m:t>k</m:t>
-                          </m:r>
-                        </m:sub>
-                      </m:sSub>
-                    </m:e>
-                  </m:d>
-                </m:e>
-              </m:nary>
-            </m:num>
-            <m:den>
-              <m:nary>
-                <m:naryPr>
-                  <m:chr m:val="∑"/>
-                  <m:limLoc m:val="undOvr"/>
-                  <m:subHide m:val="off"/>
-                  <m:supHide m:val="on"/>
-                </m:naryPr>
-                <m:sub>
-                  <m:r>
-                    <m:t>i</m:t>
-                  </m:r>
-                </m:sub>
-                <m:sup>
-                  <m:r>
-                    <m:t>​</m:t>
-                  </m:r>
-                </m:sup>
-                <m:e>
-                  <m:d>
-                    <m:dPr>
-                      <m:begChr m:val="("/>
-                      <m:sepChr m:val=""/>
-                      <m:endChr m:val=")"/>
-                      <m:grow/>
-                    </m:dPr>
-                    <m:e>
-                      <m:sSub>
-                        <m:e>
-                          <m:r>
-                            <m:t>x</m:t>
-                          </m:r>
-                        </m:e>
-                        <m:sub>
-                          <m:r>
-                            <m:t>i</m:t>
-                          </m:r>
-                          <m:r>
-                            <m:t>j</m:t>
-                          </m:r>
-                        </m:sub>
-                      </m:sSub>
-                      <m:r>
-                        <m:rPr>
-                          <m:sty m:val="p"/>
-                        </m:rPr>
-                        <m:t>+</m:t>
-                      </m:r>
-                      <m:sSub>
-                        <m:e>
-                          <m:r>
-                            <m:t>x</m:t>
-                          </m:r>
-                        </m:e>
-                        <m:sub>
-                          <m:r>
-                            <m:t>i</m:t>
-                          </m:r>
-                          <m:r>
-                            <m:t>k</m:t>
-                          </m:r>
-                        </m:sub>
-                      </m:sSub>
-                    </m:e>
-                  </m:d>
-                </m:e>
-              </m:nary>
-            </m:den>
-          </m:f>
-          <m:r>
-            <m:rPr>
-              <m:sty m:val="p"/>
-            </m:rPr>
-            <m:t>,</m:t>
-          </m:r>
-          <m:r>
-            <m:t>  </m:t>
-          </m:r>
-          <m:sSub>
-            <m:e>
-              <m:r>
-                <m:rPr>
-                  <m:nor/>
-                  <m:sty m:val="p"/>
-                </m:rPr>
-                <m:t>Jaccard</m:t>
-              </m:r>
-            </m:e>
-            <m:sub>
-              <m:r>
-                <m:t>j</m:t>
-              </m:r>
-              <m:r>
-                <m:t>k</m:t>
-              </m:r>
-            </m:sub>
-          </m:sSub>
-          <m:r>
-            <m:rPr>
-              <m:sty m:val="p"/>
-            </m:rPr>
-            <m:t>=</m:t>
-          </m:r>
-          <m:r>
-            <m:t>1</m:t>
-          </m:r>
-          <m:r>
-            <m:rPr>
-              <m:sty m:val="p"/>
-            </m:rPr>
-            <m:t>−</m:t>
-          </m:r>
-          <m:f>
-            <m:fPr>
-              <m:type m:val="bar"/>
-            </m:fPr>
-            <m:num>
-              <m:r>
-                <m:t>a</m:t>
-              </m:r>
-            </m:num>
-            <m:den>
-              <m:r>
-                <m:t>a</m:t>
-              </m:r>
-              <m:r>
-                <m:rPr>
-                  <m:sty m:val="p"/>
-                </m:rPr>
-                <m:t>+</m:t>
-              </m:r>
-              <m:r>
-                <m:t>b</m:t>
-              </m:r>
-              <m:r>
-                <m:rPr>
-                  <m:sty m:val="p"/>
-                </m:rPr>
-                <m:t>+</m:t>
-              </m:r>
-              <m:r>
-                <m:t>c</m:t>
-              </m:r>
-            </m:den>
-          </m:f>
+          </m:d>
         </m:oMath>
       </m:oMathPara>
     </w:p>
@@ -5243,109 +4985,7 @@
         <w:pStyle w:val="FirstParagraph"/>
       </w:pPr>
       <w:r>
-        <w:t xml:space="preserve">where</w:t>
-      </w:r>
-      <w:r>
-        <w:t xml:space="preserve"> </w:t>
-      </w:r>
-      <m:oMath>
-        <m:sSub>
-          <m:e>
-            <m:r>
-              <m:t>x</m:t>
-            </m:r>
-          </m:e>
-          <m:sub>
-            <m:r>
-              <m:t>i</m:t>
-            </m:r>
-            <m:r>
-              <m:t>j</m:t>
-            </m:r>
-          </m:sub>
-        </m:sSub>
-      </m:oMath>
-      <w:r>
-        <w:t xml:space="preserve"> </w:t>
-      </w:r>
-      <w:r>
-        <w:t xml:space="preserve">is the activity (detection count) of species</w:t>
-      </w:r>
-      <w:r>
-        <w:t xml:space="preserve"> </w:t>
-      </w:r>
-      <m:oMath>
-        <m:r>
-          <m:t>i</m:t>
-        </m:r>
-      </m:oMath>
-      <w:r>
-        <w:t xml:space="preserve"> </w:t>
-      </w:r>
-      <w:r>
-        <w:t xml:space="preserve">at recorder</w:t>
-      </w:r>
-      <w:r>
-        <w:t xml:space="preserve"> </w:t>
-      </w:r>
-      <m:oMath>
-        <m:r>
-          <m:t>j</m:t>
-        </m:r>
-      </m:oMath>
-      <w:r>
-        <w:t xml:space="preserve">, and for Jaccard</w:t>
-      </w:r>
-      <w:r>
-        <w:t xml:space="preserve"> </w:t>
-      </w:r>
-      <m:oMath>
-        <m:r>
-          <m:t>a</m:t>
-        </m:r>
-      </m:oMath>
-      <w:r>
-        <w:t xml:space="preserve"> </w:t>
-      </w:r>
-      <w:r>
-        <w:t xml:space="preserve">is</w:t>
-      </w:r>
-      <w:r>
-        <w:t xml:space="preserve"> </w:t>
-      </w:r>
-      <w:r>
-        <w:t xml:space="preserve">the number of species shared by both recorders and</w:t>
-      </w:r>
-      <w:r>
-        <w:t xml:space="preserve"> </w:t>
-      </w:r>
-      <m:oMath>
-        <m:r>
-          <m:t>b</m:t>
-        </m:r>
-        <m:r>
-          <m:rPr>
-            <m:sty m:val="p"/>
-          </m:rPr>
-          <m:t>,</m:t>
-        </m:r>
-        <m:r>
-          <m:t>c</m:t>
-        </m:r>
-      </m:oMath>
-      <w:r>
-        <w:t xml:space="preserve"> </w:t>
-      </w:r>
-      <w:r>
-        <w:t xml:space="preserve">the numbers unique to each.</w:t>
-      </w:r>
-    </w:p>
-    <w:p>
-      <w:pPr>
-        <w:pStyle w:val="BodyText"/>
-      </w:pPr>
-      <w:r>
-        <w:t xml:space="preserve">Following the course emphasis on</w:t>
+        <w:t xml:space="preserve">We report each distance effect as its</w:t>
       </w:r>
       <w:r>
         <w:t xml:space="preserve"> </w:t>
@@ -5355,50 +4995,43 @@
           <w:b/>
           <w:bCs/>
         </w:rPr>
-        <w:t xml:space="preserve">effect sizes over p-values</w:t>
-      </w:r>
-      <w:r>
-        <w:t xml:space="preserve">, every distance effect is reported as</w:t>
-      </w:r>
-      <w:r>
-        <w:t xml:space="preserve"> </w:t>
-      </w:r>
-      <w:r>
-        <w:t xml:space="preserve">its</w:t>
-      </w:r>
-      <w:r>
-        <w:t xml:space="preserve"> </w:t>
-      </w:r>
-      <w:r>
-        <w:rPr>
-          <w:b/>
-          <w:bCs/>
-        </w:rPr>
         <w:t xml:space="preserve">slope (per +10 m) with a 95% confidence interval</w:t>
       </w:r>
       <w:r>
         <w:t xml:space="preserve"> </w:t>
       </w:r>
       <w:r>
-        <w:t xml:space="preserve">(plus an R²); a CI that excludes zero</w:t>
-      </w:r>
-      <w:r>
-        <w:t xml:space="preserve"> </w:t>
-      </w:r>
-      <w:r>
-        <w:t xml:space="preserve">indicates an effect. Figures show the model’s fitted line with a 95% band; the points are adjusted for</w:t>
-      </w:r>
-      <w:r>
-        <w:t xml:space="preserve"> </w:t>
-      </w:r>
-      <w:r>
-        <w:t xml:space="preserve">the day random effect (so day-to-day baseline differences are removed and the points sit close to the</w:t>
-      </w:r>
-      <w:r>
-        <w:t xml:space="preserve"> </w:t>
-      </w:r>
-      <w:r>
-        <w:t xml:space="preserve">line), and the symbol marks whether the point is from the first or second day that spacing was used.</w:t>
+        <w:t xml:space="preserve">and an R²,</w:t>
+      </w:r>
+      <w:r>
+        <w:t xml:space="preserve"> </w:t>
+      </w:r>
+      <w:r>
+        <w:t xml:space="preserve">rather than a p-value, because the size and direction of an effect are more informative than</w:t>
+      </w:r>
+      <w:r>
+        <w:t xml:space="preserve"> </w:t>
+      </w:r>
+      <w:r>
+        <w:t xml:space="preserve">statistical significance alone, especially in a small study. A confidence interval that excludes zero</w:t>
+      </w:r>
+      <w:r>
+        <w:t xml:space="preserve"> </w:t>
+      </w:r>
+      <w:r>
+        <w:t xml:space="preserve">indicates an effect. Figures show the model’s fitted line with a 95% band; points are adjusted for the</w:t>
+      </w:r>
+      <w:r>
+        <w:t xml:space="preserve"> </w:t>
+      </w:r>
+      <w:r>
+        <w:t xml:space="preserve">day random effect (so day-to-day baseline differences are removed and the points sit close to the</w:t>
+      </w:r>
+      <w:r>
+        <w:t xml:space="preserve"> </w:t>
+      </w:r>
+      <w:r>
+        <w:t xml:space="preserve">line), and the symbol marks the first or second replicate day.</w:t>
       </w:r>
     </w:p>
     <w:p>
@@ -12938,7 +12571,13 @@
         <w:t xml:space="preserve"> </w:t>
       </w:r>
       <w:r>
-        <w:t xml:space="preserve">directly tests P2 (is forest steeper than pasture?). The forest − pasture difference is</w:t>
+        <w:t xml:space="preserve">directly tests P2 (does dissimilarity rise faster with distance in forest than pasture?).</w:t>
+      </w:r>
+      <w:r>
+        <w:t xml:space="preserve"> </w:t>
+      </w:r>
+      <w:r>
+        <w:t xml:space="preserve">The forest − pasture difference is</w:t>
       </w:r>
       <w:r>
         <w:t xml:space="preserve"> </w:t>
@@ -12961,13 +12600,27 @@
           <w:b/>
           <w:bCs/>
         </w:rPr>
-        <w:t xml:space="preserve">pasture</w:t>
-      </w:r>
-      <w:r>
-        <w:t xml:space="preserve"> </w:t>
-      </w:r>
-      <w:r>
-        <w:t xml:space="preserve">is the steeper habitat, the</w:t>
+        <w:t xml:space="preserve">dissimilarity increases faster with distance</w:t>
+      </w:r>
+      <w:r>
+        <w:rPr>
+          <w:b/>
+          <w:bCs/>
+        </w:rPr>
+        <w:t xml:space="preserve"> </w:t>
+      </w:r>
+      <w:r>
+        <w:rPr>
+          <w:b/>
+          <w:bCs/>
+        </w:rPr>
+        <w:t xml:space="preserve">in pasture than in forest</w:t>
+      </w:r>
+      <w:r>
+        <w:t xml:space="preserve"> </w:t>
+      </w:r>
+      <w:r>
+        <w:t xml:space="preserve">(a larger distance slope in pasture), the</w:t>
       </w:r>
       <w:r>
         <w:t xml:space="preserve"> </w:t>
@@ -12983,19 +12636,19 @@
         <w:t xml:space="preserve"> </w:t>
       </w:r>
       <w:r>
-        <w:t xml:space="preserve">of what we predicted. The CI</w:t>
-      </w:r>
-      <w:r>
-        <w:t xml:space="preserve"> </w:t>
-      </w:r>
-      <w:r>
-        <w:t xml:space="preserve">still includes zero (so it is not formally proven), but together with Table 3 everything points to the</w:t>
-      </w:r>
-      <w:r>
-        <w:t xml:space="preserve"> </w:t>
-      </w:r>
-      <w:r>
-        <w:t xml:space="preserve">spatial signal being in the</w:t>
+        <w:t xml:space="preserve">of what we predicted.</w:t>
+      </w:r>
+      <w:r>
+        <w:t xml:space="preserve"> </w:t>
+      </w:r>
+      <w:r>
+        <w:t xml:space="preserve">The CI still includes zero (so it is not formally proven), but together with Table 3 everything points</w:t>
+      </w:r>
+      <w:r>
+        <w:t xml:space="preserve"> </w:t>
+      </w:r>
+      <w:r>
+        <w:t xml:space="preserve">to the spatial signal being in the</w:t>
       </w:r>
       <w:r>
         <w:t xml:space="preserve"> </w:t>
@@ -17633,7 +17286,7 @@
           <w:b/>
           <w:bCs/>
         </w:rPr>
-        <w:t xml:space="preserve">habitat prediction (P2: forest steeper)</w:t>
+        <w:t xml:space="preserve">habitat prediction (P2: dissimilarity rising faster with distance in forest)</w:t>
       </w:r>
       <w:r>
         <w:t xml:space="preserve"> </w:t>
@@ -17649,16 +17302,30 @@
           <w:b/>
           <w:bCs/>
         </w:rPr>
-        <w:t xml:space="preserve">not supported</w:t>
-      </w:r>
-      <w:r>
-        <w:t xml:space="preserve">; if anything the steeper decay is</w:t>
-      </w:r>
-      <w:r>
-        <w:t xml:space="preserve"> </w:t>
-      </w:r>
-      <w:r>
-        <w:t xml:space="preserve">in pasture. The mechanistic expectation (forest attenuates sound, giving faster decay) is not borne out. A</w:t>
+        <w:t xml:space="preserve">not</w:t>
+      </w:r>
+      <w:r>
+        <w:rPr>
+          <w:b/>
+          <w:bCs/>
+        </w:rPr>
+        <w:t xml:space="preserve"> </w:t>
+      </w:r>
+      <w:r>
+        <w:rPr>
+          <w:b/>
+          <w:bCs/>
+        </w:rPr>
+        <w:t xml:space="preserve">supported</w:t>
+      </w:r>
+      <w:r>
+        <w:t xml:space="preserve">; if anything dissimilarity rose faster with distance in pasture. The mechanistic</w:t>
+      </w:r>
+      <w:r>
+        <w:t xml:space="preserve"> </w:t>
+      </w:r>
+      <w:r>
+        <w:t xml:space="preserve">expectation (forest attenuates sound, giving faster decay) is not borne out. A</w:t>
       </w:r>
       <w:r>
         <w:t xml:space="preserve"> </w:t>

</xml_diff>